<commit_message>
Prepare DC-004 multi-run validation proposal
</commit_message>
<xml_diff>
--- a/01-engineering-source-documents/OT Project Demonstrator Design.docx
+++ b/01-engineering-source-documents/OT Project Demonstrator Design.docx
@@ -21,16 +21,13 @@
         <w:spacing w:before="240" w:after="240"/>
       </w:pPr>
       <w:r>
-        <w:rPr>
-          <w:sz w:val="20"/>
-        </w:rPr>
         <w:t>Operational Technology Graduate Demonstration Project</w:t>
         <w:br/>
         <w:t>Document: OT Project Demonstrator Design</w:t>
         <w:br/>
-        <w:t>Version: 0.2</w:t>
+        <w:t>Version: 0.3 — Proposed DC-004 controlled revision</w:t>
         <w:br/>
-        <w:t>Status: Draft</w:t>
+        <w:t>Status: Draft — proposed change under independent review; v0.2 remains the accepted baseline</w:t>
       </w:r>
     </w:p>
     <w:p>
@@ -22842,6 +22839,937 @@
           <w:i w:val="0"/>
         </w:rPr>
         <w:t>DC-003 must be applied and cross-document verified before final Step 9 acceptance and implementation authorisation. This amendment satisfies the Demonstrator Design portion of that gate; it does not itself authorise implementation and it changes no requirement.</w:t>
+      </w:r>
+    </w:p>
+    <w:p>
+      <w:pPr>
+        <w:pStyle w:val="Heading1"/>
+      </w:pPr>
+      <w:r>
+        <w:t>36. Proposed Controlled Amendment — DC-004 Multi-Run Exploratory Validation Determination</w:t>
+      </w:r>
+    </w:p>
+    <w:p>
+      <w:pPr/>
+      <w:r>
+        <w:t>This proposed amendment defines the demonstrator structure needed to determine one multi-run exploratory catalogue test without weakening the accepted one-execution/one-run invariant. It adds stable constituent-case definitions and a separate immutable composite validation-assurance result. It introduces no electrical behaviour, operational event or second validation engine.</w:t>
+      </w:r>
+    </w:p>
+    <w:p>
+      <w:pPr>
+        <w:pStyle w:val="Heading2"/>
+      </w:pPr>
+      <w:r>
+        <w:t>36.1 Validation and Evidence Record Extensions</w:t>
+      </w:r>
+    </w:p>
+    <w:tbl>
+      <w:tblPr>
+        <w:tblW w:type="auto" w:w="0"/>
+        <w:tblLayout w:type="fixed"/>
+        <w:tblLook w:firstColumn="1" w:firstRow="1" w:lastColumn="0" w:lastRow="0" w:noHBand="0" w:noVBand="1" w:val="04A0"/>
+        <w:tblBorders>
+          <w:top w:val="single" w:sz="10" w:space="0" w:color="000000"/>
+          <w:left w:val="single" w:sz="10" w:space="0" w:color="000000"/>
+          <w:bottom w:val="single" w:sz="10" w:space="0" w:color="000000"/>
+          <w:right w:val="single" w:sz="10" w:space="0" w:color="000000"/>
+          <w:insideH w:val="single" w:sz="10" w:space="0" w:color="000000"/>
+          <w:insideV w:val="single" w:sz="10" w:space="0" w:color="000000"/>
+        </w:tblBorders>
+      </w:tblPr>
+      <w:tblGrid>
+        <w:gridCol w:w="4680"/>
+        <w:gridCol w:w="4680"/>
+      </w:tblGrid>
+      <w:tr>
+        <w:trPr>
+          <w:tblHeader w:val="true"/>
+          <w:cantSplit/>
+        </w:trPr>
+        <w:tc>
+          <w:tcPr>
+            <w:tcW w:type="dxa" w:w="2700"/>
+            <w:vAlign w:val="center"/>
+            <w:tcMar>
+              <w:top w:w="80" w:type="dxa"/>
+              <w:start w:w="100" w:type="dxa"/>
+              <w:bottom w:w="80" w:type="dxa"/>
+              <w:end w:w="100" w:type="dxa"/>
+            </w:tcMar>
+            <w:shd w:fill="E7E7E7"/>
+          </w:tcPr>
+          <w:p>
+            <w:pPr>
+              <w:spacing w:before="40" w:after="40"/>
+              <w:jc w:val="center"/>
+            </w:pPr>
+            <w:r>
+              <w:rPr>
+                <w:b/>
+                <w:sz w:val="19"/>
+              </w:rPr>
+              <w:t>Record</w:t>
+            </w:r>
+          </w:p>
+        </w:tc>
+        <w:tc>
+          <w:tcPr>
+            <w:tcW w:type="dxa" w:w="6660"/>
+            <w:vAlign w:val="center"/>
+            <w:tcMar>
+              <w:top w:w="80" w:type="dxa"/>
+              <w:start w:w="100" w:type="dxa"/>
+              <w:bottom w:w="80" w:type="dxa"/>
+              <w:end w:w="100" w:type="dxa"/>
+            </w:tcMar>
+            <w:shd w:fill="E7E7E7"/>
+          </w:tcPr>
+          <w:p>
+            <w:pPr>
+              <w:spacing w:before="40" w:after="40"/>
+              <w:jc w:val="center"/>
+            </w:pPr>
+            <w:r>
+              <w:rPr>
+                <w:b/>
+                <w:sz w:val="19"/>
+              </w:rPr>
+              <w:t>Minimum links / content</w:t>
+            </w:r>
+          </w:p>
+        </w:tc>
+      </w:tr>
+      <w:tr>
+        <w:trPr>
+          <w:cantSplit/>
+        </w:trPr>
+        <w:tc>
+          <w:tcPr>
+            <w:tcW w:type="dxa" w:w="2700"/>
+            <w:vAlign w:val="center"/>
+            <w:tcMar>
+              <w:top w:w="80" w:type="dxa"/>
+              <w:start w:w="100" w:type="dxa"/>
+              <w:bottom w:w="80" w:type="dxa"/>
+              <w:end w:w="100" w:type="dxa"/>
+            </w:tcMar>
+          </w:tcPr>
+          <w:p>
+            <w:pPr>
+              <w:spacing w:before="40" w:after="40"/>
+              <w:jc w:val="left"/>
+            </w:pPr>
+            <w:r>
+              <w:rPr>
+                <w:b w:val="0"/>
+                <w:sz w:val="19"/>
+              </w:rPr>
+              <w:t>ConstituentCaseDefinition</w:t>
+            </w:r>
+          </w:p>
+        </w:tc>
+        <w:tc>
+          <w:tcPr>
+            <w:tcW w:type="dxa" w:w="6660"/>
+            <w:vAlign w:val="center"/>
+            <w:tcMar>
+              <w:top w:w="80" w:type="dxa"/>
+              <w:start w:w="100" w:type="dxa"/>
+              <w:bottom w:w="80" w:type="dxa"/>
+              <w:end w:w="100" w:type="dxa"/>
+            </w:tcMar>
+          </w:tcPr>
+          <w:p>
+            <w:pPr>
+              <w:spacing w:before="40" w:after="40"/>
+              <w:jc w:val="left"/>
+            </w:pPr>
+            <w:r>
+              <w:rPr>
+                <w:b w:val="0"/>
+                <w:sz w:val="19"/>
+              </w:rPr>
+              <w:t>case ID, parent test, case-definition version/hash, controlled run input/initial conditions, expected structured values and checkpoint obligations.</w:t>
+            </w:r>
+          </w:p>
+        </w:tc>
+      </w:tr>
+      <w:tr>
+        <w:trPr>
+          <w:cantSplit/>
+        </w:trPr>
+        <w:tc>
+          <w:tcPr>
+            <w:tcW w:type="dxa" w:w="2700"/>
+            <w:vAlign w:val="center"/>
+            <w:tcMar>
+              <w:top w:w="80" w:type="dxa"/>
+              <w:start w:w="100" w:type="dxa"/>
+              <w:bottom w:w="80" w:type="dxa"/>
+              <w:end w:w="100" w:type="dxa"/>
+            </w:tcMar>
+          </w:tcPr>
+          <w:p>
+            <w:pPr>
+              <w:spacing w:before="40" w:after="40"/>
+              <w:jc w:val="left"/>
+            </w:pPr>
+            <w:r>
+              <w:rPr>
+                <w:b w:val="0"/>
+                <w:sz w:val="19"/>
+              </w:rPr>
+              <w:t>Constituent ValidationExecution</w:t>
+            </w:r>
+          </w:p>
+        </w:tc>
+        <w:tc>
+          <w:tcPr>
+            <w:tcW w:type="dxa" w:w="6660"/>
+            <w:vAlign w:val="center"/>
+            <w:tcMar>
+              <w:top w:w="80" w:type="dxa"/>
+              <w:start w:w="100" w:type="dxa"/>
+              <w:bottom w:w="80" w:type="dxa"/>
+              <w:end w:w="100" w:type="dxa"/>
+            </w:tcMar>
+          </w:tcPr>
+          <w:p>
+            <w:pPr>
+              <w:spacing w:before="40" w:after="40"/>
+              <w:jc w:val="left"/>
+            </w:pPr>
+            <w:r>
+              <w:rPr>
+                <w:b w:val="0"/>
+                <w:sz w:val="19"/>
+              </w:rPr>
+              <w:t>Existing execution identity plus one case ID/hash and case-specific expected values; still exactly one scenario run.</w:t>
+            </w:r>
+          </w:p>
+        </w:tc>
+      </w:tr>
+      <w:tr>
+        <w:trPr>
+          <w:cantSplit/>
+        </w:trPr>
+        <w:tc>
+          <w:tcPr>
+            <w:tcW w:type="dxa" w:w="2700"/>
+            <w:vAlign w:val="center"/>
+            <w:tcMar>
+              <w:top w:w="80" w:type="dxa"/>
+              <w:start w:w="100" w:type="dxa"/>
+              <w:bottom w:w="80" w:type="dxa"/>
+              <w:end w:w="100" w:type="dxa"/>
+            </w:tcMar>
+          </w:tcPr>
+          <w:p>
+            <w:pPr>
+              <w:spacing w:before="40" w:after="40"/>
+              <w:jc w:val="left"/>
+            </w:pPr>
+            <w:r>
+              <w:rPr>
+                <w:b w:val="0"/>
+                <w:sz w:val="19"/>
+              </w:rPr>
+              <w:t>CompositeValidationResult</w:t>
+            </w:r>
+          </w:p>
+        </w:tc>
+        <w:tc>
+          <w:tcPr>
+            <w:tcW w:type="dxa" w:w="6660"/>
+            <w:vAlign w:val="center"/>
+            <w:tcMar>
+              <w:top w:w="80" w:type="dxa"/>
+              <w:start w:w="100" w:type="dxa"/>
+              <w:bottom w:w="80" w:type="dxa"/>
+              <w:end w:w="100" w:type="dxa"/>
+            </w:tcMar>
+          </w:tcPr>
+          <w:p>
+            <w:pPr>
+              <w:spacing w:before="40" w:after="40"/>
+              <w:jc w:val="left"/>
+            </w:pPr>
+            <w:r>
+              <w:rPr>
+                <w:b w:val="0"/>
+                <w:sz w:val="19"/>
+              </w:rPr>
+              <w:t>Composite ID, parent test/catalogue identities, EXPLORATORY class, common build/configuration, exact required case set, constituent links/verdicts, completeness and aggregate determination/reason.</w:t>
+            </w:r>
+          </w:p>
+        </w:tc>
+      </w:tr>
+      <w:tr>
+        <w:trPr>
+          <w:cantSplit/>
+        </w:trPr>
+        <w:tc>
+          <w:tcPr>
+            <w:tcW w:type="dxa" w:w="2700"/>
+            <w:vAlign w:val="center"/>
+            <w:tcMar>
+              <w:top w:w="80" w:type="dxa"/>
+              <w:start w:w="100" w:type="dxa"/>
+              <w:bottom w:w="80" w:type="dxa"/>
+              <w:end w:w="100" w:type="dxa"/>
+            </w:tcMar>
+          </w:tcPr>
+          <w:p>
+            <w:pPr>
+              <w:spacing w:before="40" w:after="40"/>
+              <w:jc w:val="left"/>
+            </w:pPr>
+            <w:r>
+              <w:rPr>
+                <w:b w:val="0"/>
+                <w:sz w:val="19"/>
+              </w:rPr>
+              <w:t>CompositeConstituentLink</w:t>
+            </w:r>
+          </w:p>
+        </w:tc>
+        <w:tc>
+          <w:tcPr>
+            <w:tcW w:type="dxa" w:w="6660"/>
+            <w:vAlign w:val="center"/>
+            <w:tcMar>
+              <w:top w:w="80" w:type="dxa"/>
+              <w:start w:w="100" w:type="dxa"/>
+              <w:bottom w:w="80" w:type="dxa"/>
+              <w:end w:w="100" w:type="dxa"/>
+            </w:tcMar>
+          </w:tcPr>
+          <w:p>
+            <w:pPr>
+              <w:spacing w:before="40" w:after="40"/>
+              <w:jc w:val="left"/>
+            </w:pPr>
+            <w:r>
+              <w:rPr>
+                <w:b w:val="0"/>
+                <w:sz w:val="19"/>
+              </w:rPr>
+              <w:t>Composite ID, case ID/hash, execution ID, run ID, evidence references and constituent verdict.</w:t>
+            </w:r>
+          </w:p>
+        </w:tc>
+      </w:tr>
+    </w:tbl>
+    <w:p>
+      <w:pPr/>
+    </w:p>
+    <w:p>
+      <w:pPr/>
+      <w:r>
+        <w:t>ConstituentCaseDefinition is controlled definition data, not runtime network configuration. CompositeValidationResult is a validation-assurance record, not a ScenarioRun, ValidationExecution or operational event. Generated record identities are UUIDs; stable case IDs are controlled engineering identifiers within their parent test.</w:t>
+      </w:r>
+    </w:p>
+    <w:p>
+      <w:pPr>
+        <w:pStyle w:val="Heading2"/>
+      </w:pPr>
+      <w:r>
+        <w:t>36.2 Ownership and Service Boundaries</w:t>
+      </w:r>
+    </w:p>
+    <w:p>
+      <w:pPr/>
+      <w:r>
+        <w:t>•</w:t>
+        <w:tab/>
+        <w:t>The validation catalogue loader owns case definitions and their hash-controlled identity.</w:t>
+      </w:r>
+    </w:p>
+    <w:p>
+      <w:pPr/>
+      <w:r>
+        <w:t>•</w:t>
+        <w:tab/>
+        <w:t>The validation service verifies test/case membership, binds one case to one existing run, fixes expected values before evidence capture and applies the existing generic comparison mechanism.</w:t>
+      </w:r>
+    </w:p>
+    <w:p>
+      <w:pPr/>
+      <w:r>
+        <w:t>•</w:t>
+        <w:tab/>
+        <w:t>The scenario/topology/outage/restoration modules remain the sole authorities for observed and derived engineering results; they contain no case verdicts or section-specific validation branches.</w:t>
+      </w:r>
+    </w:p>
+    <w:p>
+      <w:pPr/>
+      <w:r>
+        <w:t>•</w:t>
+        <w:tab/>
+        <w:t>A bounded validation-assurance coordinator assembles a composite only from repository-returned finalised constituent records and applies the exact completeness/aggregate rules from the Validation Plan.</w:t>
+      </w:r>
+    </w:p>
+    <w:p>
+      <w:pPr/>
+      <w:r>
+        <w:t>•</w:t>
+        <w:tab/>
+        <w:t>The workspace/evidence API returns complete backend-owned constituent/composite projections; React does not calculate completeness or verdicts.</w:t>
+      </w:r>
+    </w:p>
+    <w:p>
+      <w:pPr>
+        <w:pStyle w:val="Heading2"/>
+      </w:pPr>
+      <w:r>
+        <w:t>36.3 Persistence and Immutability</w:t>
+      </w:r>
+    </w:p>
+    <w:p>
+      <w:pPr/>
+      <w:r>
+        <w:t>SQLite stores composite headers and constituent links separately from scenario, operational event and evidence tables. Repository operations permit controlled insert/assembly/finalisation. Database-level guards reject update/delete of a finalised composite and reject update/delete/replacement or late insertion of finalised constituent membership. Missing, unexecuted, duplicate or identity-mismatched cases leave an assembly incomplete without a verdict. Repeats create new composite, run, execution and evidence identities.</w:t>
+      </w:r>
+    </w:p>
+    <w:p>
+      <w:pPr>
+        <w:pStyle w:val="Heading2"/>
+      </w:pPr>
+      <w:r>
+        <w:t>36.4 Review Projection and Interaction</w:t>
+      </w:r>
+    </w:p>
+    <w:p>
+      <w:pPr/>
+      <w:r>
+        <w:t>The Validation/Evidence workspace presents the parent test identity, aggregate status/determination, required/present/missing cases and a row for every case showing case ID, execution ID, full run ID, case verdict and evidence link. Common build, configuration, test-definition/catalogue and EXPLORATORY identities remain visible. A reviewer can open each constituent independently. FORMAL progress calculations exclude constituent and composite exploratory records.</w:t>
+      </w:r>
+    </w:p>
+    <w:p>
+      <w:pPr/>
+      <w:r>
+        <w:t>Finalise Composite is backend-authorised only when the exact controlled completeness rule is satisfied. The interface does not offer PASS selection, allow constituent substitution or treat a visual checklist as determination evidence. An incomplete assembly is labelled INCOMPLETE / NO VERDICT rather than PASS, FAIL or silently BLOCKED-TEST.</w:t>
+      </w:r>
+    </w:p>
+    <w:p>
+      <w:pPr>
+        <w:pStyle w:val="Heading2"/>
+      </w:pPr>
+      <w:r>
+        <w:t>36.5 Evidence Export</w:t>
+      </w:r>
+    </w:p>
+    <w:p>
+      <w:pPr/>
+      <w:r>
+        <w:t>The accepted I8 per-execution ZIP remains unchanged. If a test-level package is requested, it is generated from a finalised immutable composite plus all preserved constituent executions/evidence. Its manifest lists the composite, every case/execution/run/evidence identity, source build and generation build; the package is EXPLORATORY. Generation never replays or reconstructs mutable scenario state and never changes the aggregate determination.</w:t>
+      </w:r>
+    </w:p>
+    <w:p>
+      <w:pPr>
+        <w:pStyle w:val="Heading2"/>
+      </w:pPr>
+      <w:r>
+        <w:t>36.6 Prohibited Implementations</w:t>
+      </w:r>
+    </w:p>
+    <w:tbl>
+      <w:tblPr>
+        <w:tblW w:type="auto" w:w="0"/>
+        <w:tblLayout w:type="fixed"/>
+        <w:tblLook w:firstColumn="1" w:firstRow="1" w:lastColumn="0" w:lastRow="0" w:noHBand="0" w:noVBand="1" w:val="04A0"/>
+        <w:tblBorders>
+          <w:top w:val="single" w:sz="10" w:space="0" w:color="000000"/>
+          <w:left w:val="single" w:sz="10" w:space="0" w:color="000000"/>
+          <w:bottom w:val="single" w:sz="10" w:space="0" w:color="000000"/>
+          <w:right w:val="single" w:sz="10" w:space="0" w:color="000000"/>
+          <w:insideH w:val="single" w:sz="10" w:space="0" w:color="000000"/>
+          <w:insideV w:val="single" w:sz="10" w:space="0" w:color="000000"/>
+        </w:tblBorders>
+      </w:tblPr>
+      <w:tblGrid>
+        <w:gridCol w:w="4680"/>
+        <w:gridCol w:w="4680"/>
+      </w:tblGrid>
+      <w:tr>
+        <w:trPr>
+          <w:tblHeader w:val="true"/>
+          <w:cantSplit/>
+        </w:trPr>
+        <w:tc>
+          <w:tcPr>
+            <w:tcW w:type="dxa" w:w="3300"/>
+            <w:vAlign w:val="center"/>
+            <w:tcMar>
+              <w:top w:w="80" w:type="dxa"/>
+              <w:start w:w="100" w:type="dxa"/>
+              <w:bottom w:w="80" w:type="dxa"/>
+              <w:end w:w="100" w:type="dxa"/>
+            </w:tcMar>
+            <w:shd w:fill="E7E7E7"/>
+          </w:tcPr>
+          <w:p>
+            <w:pPr>
+              <w:spacing w:before="40" w:after="40"/>
+              <w:jc w:val="center"/>
+            </w:pPr>
+            <w:r>
+              <w:rPr>
+                <w:b/>
+                <w:sz w:val="19"/>
+              </w:rPr>
+              <w:t>Prohibited shortcut</w:t>
+            </w:r>
+          </w:p>
+        </w:tc>
+        <w:tc>
+          <w:tcPr>
+            <w:tcW w:type="dxa" w:w="6060"/>
+            <w:vAlign w:val="center"/>
+            <w:tcMar>
+              <w:top w:w="80" w:type="dxa"/>
+              <w:start w:w="100" w:type="dxa"/>
+              <w:bottom w:w="80" w:type="dxa"/>
+              <w:end w:w="100" w:type="dxa"/>
+            </w:tcMar>
+            <w:shd w:fill="E7E7E7"/>
+          </w:tcPr>
+          <w:p>
+            <w:pPr>
+              <w:spacing w:before="40" w:after="40"/>
+              <w:jc w:val="center"/>
+            </w:pPr>
+            <w:r>
+              <w:rPr>
+                <w:b/>
+                <w:sz w:val="19"/>
+              </w:rPr>
+              <w:t>Required design</w:t>
+            </w:r>
+          </w:p>
+        </w:tc>
+      </w:tr>
+      <w:tr>
+        <w:trPr>
+          <w:cantSplit/>
+        </w:trPr>
+        <w:tc>
+          <w:tcPr>
+            <w:tcW w:type="dxa" w:w="3300"/>
+            <w:vAlign w:val="center"/>
+            <w:tcMar>
+              <w:top w:w="80" w:type="dxa"/>
+              <w:start w:w="100" w:type="dxa"/>
+              <w:bottom w:w="80" w:type="dxa"/>
+              <w:end w:w="100" w:type="dxa"/>
+            </w:tcMar>
+          </w:tcPr>
+          <w:p>
+            <w:pPr>
+              <w:spacing w:before="40" w:after="40"/>
+              <w:jc w:val="left"/>
+            </w:pPr>
+            <w:r>
+              <w:rPr>
+                <w:b w:val="0"/>
+                <w:sz w:val="19"/>
+              </w:rPr>
+              <w:t>One execution references several runs</w:t>
+            </w:r>
+          </w:p>
+        </w:tc>
+        <w:tc>
+          <w:tcPr>
+            <w:tcW w:type="dxa" w:w="6060"/>
+            <w:vAlign w:val="center"/>
+            <w:tcMar>
+              <w:top w:w="80" w:type="dxa"/>
+              <w:start w:w="100" w:type="dxa"/>
+              <w:bottom w:w="80" w:type="dxa"/>
+              <w:end w:w="100" w:type="dxa"/>
+            </w:tcMar>
+          </w:tcPr>
+          <w:p>
+            <w:pPr>
+              <w:spacing w:before="40" w:after="40"/>
+              <w:jc w:val="left"/>
+            </w:pPr>
+            <w:r>
+              <w:rPr>
+                <w:b w:val="0"/>
+                <w:sz w:val="19"/>
+              </w:rPr>
+              <w:t>Preserve one constituent execution per one scenario run; compose only through the separate result.</w:t>
+            </w:r>
+          </w:p>
+        </w:tc>
+      </w:tr>
+      <w:tr>
+        <w:trPr>
+          <w:cantSplit/>
+        </w:trPr>
+        <w:tc>
+          <w:tcPr>
+            <w:tcW w:type="dxa" w:w="3300"/>
+            <w:vAlign w:val="center"/>
+            <w:tcMar>
+              <w:top w:w="80" w:type="dxa"/>
+              <w:start w:w="100" w:type="dxa"/>
+              <w:bottom w:w="80" w:type="dxa"/>
+              <w:end w:w="100" w:type="dxa"/>
+            </w:tcMar>
+          </w:tcPr>
+          <w:p>
+            <w:pPr>
+              <w:spacing w:before="40" w:after="40"/>
+              <w:jc w:val="left"/>
+            </w:pPr>
+            <w:r>
+              <w:rPr>
+                <w:b w:val="0"/>
+                <w:sz w:val="19"/>
+              </w:rPr>
+              <w:t>Section-ID-specific PASS code</w:t>
+            </w:r>
+          </w:p>
+        </w:tc>
+        <w:tc>
+          <w:tcPr>
+            <w:tcW w:type="dxa" w:w="6060"/>
+            <w:vAlign w:val="center"/>
+            <w:tcMar>
+              <w:top w:w="80" w:type="dxa"/>
+              <w:start w:w="100" w:type="dxa"/>
+              <w:bottom w:w="80" w:type="dxa"/>
+              <w:end w:w="100" w:type="dxa"/>
+            </w:tcMar>
+          </w:tcPr>
+          <w:p>
+            <w:pPr>
+              <w:spacing w:before="40" w:after="40"/>
+              <w:jc w:val="left"/>
+            </w:pPr>
+            <w:r>
+              <w:rPr>
+                <w:b w:val="0"/>
+                <w:sz w:val="19"/>
+              </w:rPr>
+              <w:t>Use controlled case definitions plus the generic expected-versus-observed comparison.</w:t>
+            </w:r>
+          </w:p>
+        </w:tc>
+      </w:tr>
+      <w:tr>
+        <w:trPr>
+          <w:cantSplit/>
+        </w:trPr>
+        <w:tc>
+          <w:tcPr>
+            <w:tcW w:type="dxa" w:w="3300"/>
+            <w:vAlign w:val="center"/>
+            <w:tcMar>
+              <w:top w:w="80" w:type="dxa"/>
+              <w:start w:w="100" w:type="dxa"/>
+              <w:bottom w:w="80" w:type="dxa"/>
+              <w:end w:w="100" w:type="dxa"/>
+            </w:tcMar>
+          </w:tcPr>
+          <w:p>
+            <w:pPr>
+              <w:spacing w:before="40" w:after="40"/>
+              <w:jc w:val="left"/>
+            </w:pPr>
+            <w:r>
+              <w:rPr>
+                <w:b w:val="0"/>
+                <w:sz w:val="19"/>
+              </w:rPr>
+              <w:t>PASS from screenshots/manual impression</w:t>
+            </w:r>
+          </w:p>
+        </w:tc>
+        <w:tc>
+          <w:tcPr>
+            <w:tcW w:type="dxa" w:w="6060"/>
+            <w:vAlign w:val="center"/>
+            <w:tcMar>
+              <w:top w:w="80" w:type="dxa"/>
+              <w:start w:w="100" w:type="dxa"/>
+              <w:bottom w:w="80" w:type="dxa"/>
+              <w:end w:w="100" w:type="dxa"/>
+            </w:tcMar>
+          </w:tcPr>
+          <w:p>
+            <w:pPr>
+              <w:spacing w:before="40" w:after="40"/>
+              <w:jc w:val="left"/>
+            </w:pPr>
+            <w:r>
+              <w:rPr>
+                <w:b w:val="0"/>
+                <w:sz w:val="19"/>
+              </w:rPr>
+              <w:t>Require finalised constituent records, exact completeness and preserved evidence links.</w:t>
+            </w:r>
+          </w:p>
+        </w:tc>
+      </w:tr>
+      <w:tr>
+        <w:trPr>
+          <w:cantSplit/>
+        </w:trPr>
+        <w:tc>
+          <w:tcPr>
+            <w:tcW w:type="dxa" w:w="3300"/>
+            <w:vAlign w:val="center"/>
+            <w:tcMar>
+              <w:top w:w="80" w:type="dxa"/>
+              <w:start w:w="100" w:type="dxa"/>
+              <w:bottom w:w="80" w:type="dxa"/>
+              <w:end w:w="100" w:type="dxa"/>
+            </w:tcMar>
+          </w:tcPr>
+          <w:p>
+            <w:pPr>
+              <w:spacing w:before="40" w:after="40"/>
+              <w:jc w:val="left"/>
+            </w:pPr>
+            <w:r>
+              <w:rPr>
+                <w:b w:val="0"/>
+                <w:sz w:val="19"/>
+              </w:rPr>
+              <w:t>Missing/duplicate case treated as BLOCKED-TEST</w:t>
+            </w:r>
+          </w:p>
+        </w:tc>
+        <w:tc>
+          <w:tcPr>
+            <w:tcW w:type="dxa" w:w="6060"/>
+            <w:vAlign w:val="center"/>
+            <w:tcMar>
+              <w:top w:w="80" w:type="dxa"/>
+              <w:start w:w="100" w:type="dxa"/>
+              <w:bottom w:w="80" w:type="dxa"/>
+              <w:end w:w="100" w:type="dxa"/>
+            </w:tcMar>
+          </w:tcPr>
+          <w:p>
+            <w:pPr>
+              <w:spacing w:before="40" w:after="40"/>
+              <w:jc w:val="left"/>
+            </w:pPr>
+            <w:r>
+              <w:rPr>
+                <w:b w:val="0"/>
+                <w:sz w:val="19"/>
+              </w:rPr>
+              <w:t>Keep the composite INCOMPLETE with no verdict unless an accepted suspension condition explicitly supports BLOCKED-TEST.</w:t>
+            </w:r>
+          </w:p>
+        </w:tc>
+      </w:tr>
+      <w:tr>
+        <w:trPr>
+          <w:cantSplit/>
+        </w:trPr>
+        <w:tc>
+          <w:tcPr>
+            <w:tcW w:type="dxa" w:w="3300"/>
+            <w:vAlign w:val="center"/>
+            <w:tcMar>
+              <w:top w:w="80" w:type="dxa"/>
+              <w:start w:w="100" w:type="dxa"/>
+              <w:bottom w:w="80" w:type="dxa"/>
+              <w:end w:w="100" w:type="dxa"/>
+            </w:tcMar>
+          </w:tcPr>
+          <w:p>
+            <w:pPr>
+              <w:spacing w:before="40" w:after="40"/>
+              <w:jc w:val="left"/>
+            </w:pPr>
+            <w:r>
+              <w:rPr>
+                <w:b w:val="0"/>
+                <w:sz w:val="19"/>
+              </w:rPr>
+              <w:t>Frontend aggregate calculation</w:t>
+            </w:r>
+          </w:p>
+        </w:tc>
+        <w:tc>
+          <w:tcPr>
+            <w:tcW w:type="dxa" w:w="6060"/>
+            <w:vAlign w:val="center"/>
+            <w:tcMar>
+              <w:top w:w="80" w:type="dxa"/>
+              <w:start w:w="100" w:type="dxa"/>
+              <w:bottom w:w="80" w:type="dxa"/>
+              <w:end w:w="100" w:type="dxa"/>
+            </w:tcMar>
+          </w:tcPr>
+          <w:p>
+            <w:pPr>
+              <w:spacing w:before="40" w:after="40"/>
+              <w:jc w:val="left"/>
+            </w:pPr>
+            <w:r>
+              <w:rPr>
+                <w:b w:val="0"/>
+                <w:sz w:val="19"/>
+              </w:rPr>
+              <w:t>Backend validation authority owns completeness and determination; UI is projection-only.</w:t>
+            </w:r>
+          </w:p>
+        </w:tc>
+      </w:tr>
+      <w:tr>
+        <w:trPr>
+          <w:cantSplit/>
+        </w:trPr>
+        <w:tc>
+          <w:tcPr>
+            <w:tcW w:type="dxa" w:w="3300"/>
+            <w:vAlign w:val="center"/>
+            <w:tcMar>
+              <w:top w:w="80" w:type="dxa"/>
+              <w:start w:w="100" w:type="dxa"/>
+              <w:bottom w:w="80" w:type="dxa"/>
+              <w:end w:w="100" w:type="dxa"/>
+            </w:tcMar>
+          </w:tcPr>
+          <w:p>
+            <w:pPr>
+              <w:spacing w:before="40" w:after="40"/>
+              <w:jc w:val="left"/>
+            </w:pPr>
+            <w:r>
+              <w:rPr>
+                <w:b w:val="0"/>
+                <w:sz w:val="19"/>
+              </w:rPr>
+              <w:t>Exploratory composite counted as formal</w:t>
+            </w:r>
+          </w:p>
+        </w:tc>
+        <w:tc>
+          <w:tcPr>
+            <w:tcW w:type="dxa" w:w="6060"/>
+            <w:vAlign w:val="center"/>
+            <w:tcMar>
+              <w:top w:w="80" w:type="dxa"/>
+              <w:start w:w="100" w:type="dxa"/>
+              <w:bottom w:w="80" w:type="dxa"/>
+              <w:end w:w="100" w:type="dxa"/>
+            </w:tcMar>
+          </w:tcPr>
+          <w:p>
+            <w:pPr>
+              <w:spacing w:before="40" w:after="40"/>
+              <w:jc w:val="left"/>
+            </w:pPr>
+            <w:r>
+              <w:rPr>
+                <w:b w:val="0"/>
+                <w:sz w:val="19"/>
+              </w:rPr>
+              <w:t>Retain EXPLORATORY throughout query, progress, review and export boundaries.</w:t>
+            </w:r>
+          </w:p>
+        </w:tc>
+      </w:tr>
+      <w:tr>
+        <w:trPr>
+          <w:cantSplit/>
+        </w:trPr>
+        <w:tc>
+          <w:tcPr>
+            <w:tcW w:type="dxa" w:w="3300"/>
+            <w:vAlign w:val="center"/>
+            <w:tcMar>
+              <w:top w:w="80" w:type="dxa"/>
+              <w:start w:w="100" w:type="dxa"/>
+              <w:bottom w:w="80" w:type="dxa"/>
+              <w:end w:w="100" w:type="dxa"/>
+            </w:tcMar>
+          </w:tcPr>
+          <w:p>
+            <w:pPr>
+              <w:spacing w:before="40" w:after="40"/>
+              <w:jc w:val="left"/>
+            </w:pPr>
+            <w:r>
+              <w:rPr>
+                <w:b w:val="0"/>
+                <w:sz w:val="19"/>
+              </w:rPr>
+              <w:t>Reconstruct package from current state</w:t>
+            </w:r>
+          </w:p>
+        </w:tc>
+        <w:tc>
+          <w:tcPr>
+            <w:tcW w:type="dxa" w:w="6060"/>
+            <w:vAlign w:val="center"/>
+            <w:tcMar>
+              <w:top w:w="80" w:type="dxa"/>
+              <w:start w:w="100" w:type="dxa"/>
+              <w:bottom w:w="80" w:type="dxa"/>
+              <w:end w:w="100" w:type="dxa"/>
+            </w:tcMar>
+          </w:tcPr>
+          <w:p>
+            <w:pPr>
+              <w:spacing w:before="40" w:after="40"/>
+              <w:jc w:val="left"/>
+            </w:pPr>
+            <w:r>
+              <w:rPr>
+                <w:b w:val="0"/>
+                <w:sz w:val="19"/>
+              </w:rPr>
+              <w:t>Package only immutable composite and constituent source records.</w:t>
+            </w:r>
+          </w:p>
+        </w:tc>
+      </w:tr>
+    </w:tbl>
+    <w:p>
+      <w:pPr/>
+    </w:p>
+    <w:p>
+      <w:pPr>
+        <w:pStyle w:val="Heading2"/>
+      </w:pPr>
+      <w:r>
+        <w:t>36.7 Implementation and Verification Impact</w:t>
+      </w:r>
+    </w:p>
+    <w:p>
+      <w:pPr/>
+      <w:r>
+        <w:t>After independent acceptance and separate authorisation, bounded implementation affects the validation catalogue/contracts, observed comparison projection, SQLite validation-assurance migration/repository, composite service, validation/evidence read models, review presentation, optional composite export and focused tests. It does not affect topology, outage, restoration, scenario electrical algorithms, controlled configurations, the 15 operational events or the accepted RTM mappings.</w:t>
+      </w:r>
+    </w:p>
+    <w:p>
+      <w:pPr/>
+      <w:r>
+        <w:t>Verification covers all nine VT-EXP-ALL-001 and four VT-EXP-ROLE-001 cases, exact-set PASS, constituent FAIL, missing/duplicate/provenance mismatch, independent reviewability, FORMAL-progress isolation, database immutability, export links and deterministic rerun equivalence. Counts remain 24 catalogue tests, 124 requirements and 286 exact RTM relationships.</w:t>
+      </w:r>
+    </w:p>
+    <w:p>
+      <w:pPr>
+        <w:pStyle w:val="Heading2"/>
+      </w:pPr>
+      <w:r>
+        <w:t>36.8 Proposal Gate</w:t>
+      </w:r>
+    </w:p>
+    <w:p>
+      <w:pPr/>
+      <w:r>
+        <w:t>DC-004 remains proposed and does not authorise implementation or resume I9. Machine-readable catalogue/contracts remain at the accepted I8 baseline pending separate acceptance and application.</w:t>
       </w:r>
     </w:p>
     <w:sectPr>

</xml_diff>

<commit_message>
Refine DC-004 historical catalogue assurance
</commit_message>
<xml_diff>
--- a/01-engineering-source-documents/OT Project Demonstrator Design.docx
+++ b/01-engineering-source-documents/OT Project Demonstrator Design.docx
@@ -27,7 +27,7 @@
         <w:br/>
         <w:t>Version: 0.3 — Proposed DC-004 controlled revision</w:t>
         <w:br/>
-        <w:t>Status: Draft — proposed change under independent review; v0.2 remains the accepted baseline</w:t>
+        <w:t>Status: Draft — DC-004 core accepted in substance; bounded correction pending final independent review; v0.2 remains the accepted baseline</w:t>
       </w:r>
     </w:p>
     <w:p>
@@ -23159,6 +23159,47 @@
           </w:p>
         </w:tc>
       </w:tr>
+      <w:tr>
+        <w:trPr>
+          <w:cantSplit/>
+        </w:trPr>
+        <w:tc>
+          <w:tcPr>
+            <w:tcW w:type="dxa" w:w="4680"/>
+            <w:vAlign w:val="center"/>
+          </w:tcPr>
+          <w:p>
+            <w:pPr>
+              <w:spacing w:before="40" w:after="40"/>
+              <w:jc w:val="left"/>
+            </w:pPr>
+            <w:r>
+              <w:rPr>
+                <w:sz w:val="19"/>
+              </w:rPr>
+              <w:t>AcceptedCatalogueRevision</w:t>
+            </w:r>
+          </w:p>
+        </w:tc>
+        <w:tc>
+          <w:tcPr>
+            <w:tcW w:type="dxa" w:w="4680"/>
+            <w:vAlign w:val="center"/>
+          </w:tcPr>
+          <w:p>
+            <w:pPr>
+              <w:spacing w:before="40" w:after="40"/>
+              <w:jc w:val="left"/>
+            </w:pPr>
+            <w:r>
+              <w:rPr>
+                <w:sz w:val="19"/>
+              </w:rPr>
+              <w:t>immutable catalogue ID/version/hash, manifest/hash, exact test definitions and acceptance identity; independently resolvable for historical execution review/export.</w:t>
+            </w:r>
+          </w:p>
+        </w:tc>
+      </w:tr>
     </w:tbl>
     <w:p>
       <w:pPr/>
@@ -23166,7 +23207,7 @@
     <w:p>
       <w:pPr/>
       <w:r>
-        <w:t>ConstituentCaseDefinition is controlled definition data, not runtime network configuration. CompositeValidationResult is a validation-assurance record, not a ScenarioRun, ValidationExecution or operational event. Generated record identities are UUIDs; stable case IDs are controlled engineering identifiers within their parent test.</w:t>
+        <w:t>ConstituentCaseDefinition is controlled definition data, not runtime network configuration. Its comparison_expected_values contains only predetermined engineering/case expectations; build/catalogue/test/case hashes and identities are separate provenance/binding fields. AcceptedCatalogueRevision is an immutable historical engineering input. CompositeValidationResult is a validation-assurance record, not a ScenarioRun, ValidationExecution or operational event. It owns no engineering scenario time; each constituent retains its own controlled time, while any composite audit timestamp is administrative only. Generated record identities are UUIDs; stable case IDs are controlled engineering identifiers within their parent test.</w:t>
       </w:r>
     </w:p>
     <w:p>
@@ -23182,7 +23223,7 @@
       <w:r>
         <w:t>•</w:t>
         <w:tab/>
-        <w:t>The validation catalogue loader owns case definitions and their hash-controlled identity.</w:t>
+        <w:t>The validation catalogue authority owns the current accepted catalogue for new executions and an identity-based resolver for immutable accepted historical catalogue/test-definition packages.</w:t>
       </w:r>
     </w:p>
     <w:p>
@@ -23190,7 +23231,7 @@
       <w:r>
         <w:t>•</w:t>
         <w:tab/>
-        <w:t>The validation service verifies test/case membership, binds one case to one existing run, fixes expected values before evidence capture and applies the existing generic comparison mechanism.</w:t>
+        <w:t>The validation service verifies test/case membership, binds one case to one existing run, fixes engineering expected values before evidence capture and validates dynamic catalogue/test/case/build identities separately as provenance.</w:t>
       </w:r>
     </w:p>
     <w:p>
@@ -23214,7 +23255,7 @@
       <w:r>
         <w:t>•</w:t>
         <w:tab/>
-        <w:t>The workspace/evidence API returns complete backend-owned constituent/composite projections; React does not calculate completeness or verdicts.</w:t>
+        <w:t>The workspace/evidence API returns complete backend-owned constituent/composite projections and historical source-definition identities; React does not calculate completeness, provenance or verdicts.</w:t>
       </w:r>
     </w:p>
     <w:p>
@@ -23228,7 +23269,7 @@
     <w:p>
       <w:pPr/>
       <w:r>
-        <w:t>SQLite stores composite headers and constituent links separately from scenario, operational event and evidence tables. Repository operations permit controlled insert/assembly/finalisation. Database-level guards reject update/delete of a finalised composite and reject update/delete/replacement or late insertion of finalised constituent membership. Missing, unexecuted, duplicate or identity-mismatched cases leave an assembly incomplete without a verdict. Repeats create new composite, run, execution and evidence identities.</w:t>
+        <w:t>SQLite stores composite headers and constituent links separately from scenario, operational event and evidence tables. Repository operations permit controlled insert/assembly/finalisation. Database-level guards reject update/delete of a finalised composite and reject update/delete/replacement or late insertion of finalised constituent membership. Accepted catalogue packages/manifests are immutable controlled inputs outside mutable run state and remain resolvable by identity. Missing, unexecuted, duplicate or identity-mismatched cases leave an assembly incomplete without a verdict. Repeats create new composite, run, execution and evidence identities. After catalogue promotion, unfinished executions bound to an older definition are historical/read-only and cannot accept evidence or finalisation under the new definition.</w:t>
       </w:r>
     </w:p>
     <w:p>
@@ -23242,13 +23283,13 @@
     <w:p>
       <w:pPr/>
       <w:r>
-        <w:t>The Validation/Evidence workspace presents the parent test identity, aggregate status/determination, required/present/missing cases and a row for every case showing case ID, execution ID, full run ID, case verdict and evidence link. Common build, configuration, test-definition/catalogue and EXPLORATORY identities remain visible. A reviewer can open each constituent independently. FORMAL progress calculations exclude constituent and composite exploratory records.</w:t>
+        <w:t>The Validation/Evidence workspace presents the parent test identity, aggregate status/determination, required/present/missing cases and a row for every case showing case ID, execution ID, full run ID, constituent-controlled scenario/checkpoint time, case verdict and evidence link. Source catalogue/test-definition identity, common build/configuration and EXPLORATORY identity remain visible. Historical finalised executions remain reviewable through their original catalogue/definition after promotion. A reviewer can open each constituent independently. FORMAL progress calculations exclude constituent and composite exploratory records.</w:t>
       </w:r>
     </w:p>
     <w:p>
       <w:pPr/>
       <w:r>
-        <w:t>Finalise Composite is backend-authorised only when the exact controlled completeness rule is satisfied. The interface does not offer PASS selection, allow constituent substitution or treat a visual checklist as determination evidence. An incomplete assembly is labelled INCOMPLETE / NO VERDICT rather than PASS, FAIL or silently BLOCKED-TEST.</w:t>
+        <w:t>Finalise Composite is backend-authorised only when the exact controlled completeness and provenance rules are satisfied. The interface does not offer PASS selection, allow constituent substitution or treat a visual checklist as determination evidence. An incomplete assembly is labelled INCOMPLETE / NO VERDICT rather than PASS, FAIL or silently BLOCKED-TEST. The composite does not display one authoritative engineering scenario time; administrative audit time is identified separately.</w:t>
       </w:r>
     </w:p>
     <w:p>
@@ -23262,7 +23303,7 @@
     <w:p>
       <w:pPr/>
       <w:r>
-        <w:t>The accepted I8 per-execution ZIP remains unchanged. If a test-level package is requested, it is generated from a finalised immutable composite plus all preserved constituent executions/evidence. Its manifest lists the composite, every case/execution/run/evidence identity, source build and generation build; the package is EXPLORATORY. Generation never replays or reconstructs mutable scenario state and never changes the aggregate determination.</w:t>
+        <w:t>Existing I8 per-execution ZIPs remain valid and immutable. Historical export resolves the execution-bound source catalogue/test definition by stored catalogue version/hash and test-definition version/hash, not by equality with the current catalogue. A later application build may package that evidence only while retaining the original source catalogue/test-definition identity separately from the generation build; it never relabels old evidence under the promoted catalogue. A test-level package is generated only from a finalised immutable composite plus all preserved constituent records/evidence, remains EXPLORATORY and never reconstructs mutable scenario state.</w:t>
       </w:r>
     </w:p>
     <w:p>
@@ -23734,6 +23775,170 @@
           </w:p>
         </w:tc>
       </w:tr>
+      <w:tr>
+        <w:trPr>
+          <w:cantSplit/>
+        </w:trPr>
+        <w:tc>
+          <w:tcPr>
+            <w:tcW w:type="dxa" w:w="4680"/>
+            <w:vAlign w:val="center"/>
+          </w:tcPr>
+          <w:p>
+            <w:pPr>
+              <w:spacing w:before="40" w:after="40"/>
+              <w:jc w:val="left"/>
+            </w:pPr>
+            <w:r>
+              <w:rPr>
+                <w:sz w:val="19"/>
+              </w:rPr>
+              <w:t>Resolve historical export only against current catalogue</w:t>
+            </w:r>
+          </w:p>
+        </w:tc>
+        <w:tc>
+          <w:tcPr>
+            <w:tcW w:type="dxa" w:w="4680"/>
+            <w:vAlign w:val="center"/>
+          </w:tcPr>
+          <w:p>
+            <w:pPr>
+              <w:spacing w:before="40" w:after="40"/>
+              <w:jc w:val="left"/>
+            </w:pPr>
+            <w:r>
+              <w:rPr>
+                <w:sz w:val="19"/>
+              </w:rPr>
+              <w:t>Resolve the execution-bound immutable source catalogue/test definition by stored version/hash identity; keep current catalogue authority for new executions.</w:t>
+            </w:r>
+          </w:p>
+        </w:tc>
+      </w:tr>
+      <w:tr>
+        <w:trPr>
+          <w:cantSplit/>
+        </w:trPr>
+        <w:tc>
+          <w:tcPr>
+            <w:tcW w:type="dxa" w:w="4680"/>
+            <w:vAlign w:val="center"/>
+          </w:tcPr>
+          <w:p>
+            <w:pPr>
+              <w:spacing w:before="40" w:after="40"/>
+              <w:jc w:val="left"/>
+            </w:pPr>
+            <w:r>
+              <w:rPr>
+                <w:sz w:val="19"/>
+              </w:rPr>
+              <w:t>Continue unfinished old-catalogue execution after promotion</w:t>
+            </w:r>
+          </w:p>
+        </w:tc>
+        <w:tc>
+          <w:tcPr>
+            <w:tcW w:type="dxa" w:w="4680"/>
+            <w:vAlign w:val="center"/>
+          </w:tcPr>
+          <w:p>
+            <w:pPr>
+              <w:spacing w:before="40" w:after="40"/>
+              <w:jc w:val="left"/>
+            </w:pPr>
+            <w:r>
+              <w:rPr>
+                <w:sz w:val="19"/>
+              </w:rPr>
+              <w:t>Keep it historical/read-only and require a new execution under the active accepted catalogue.</w:t>
+            </w:r>
+          </w:p>
+        </w:tc>
+      </w:tr>
+      <w:tr>
+        <w:trPr>
+          <w:cantSplit/>
+        </w:trPr>
+        <w:tc>
+          <w:tcPr>
+            <w:tcW w:type="dxa" w:w="4680"/>
+            <w:vAlign w:val="center"/>
+          </w:tcPr>
+          <w:p>
+            <w:pPr>
+              <w:spacing w:before="40" w:after="40"/>
+              <w:jc w:val="left"/>
+            </w:pPr>
+            <w:r>
+              <w:rPr>
+                <w:sz w:val="19"/>
+              </w:rPr>
+              <w:t>Compare dynamic hashes/build ID as engineering expected values</w:t>
+            </w:r>
+          </w:p>
+        </w:tc>
+        <w:tc>
+          <w:tcPr>
+            <w:tcW w:type="dxa" w:w="4680"/>
+            <w:vAlign w:val="center"/>
+          </w:tcPr>
+          <w:p>
+            <w:pPr>
+              <w:spacing w:before="40" w:after="40"/>
+              <w:jc w:val="left"/>
+            </w:pPr>
+            <w:r>
+              <w:rPr>
+                <w:sz w:val="19"/>
+              </w:rPr>
+              <w:t>Validate them separately as provenance/binding invariants; comparison_expected_values contains predetermined engineering/case expectations only.</w:t>
+            </w:r>
+          </w:p>
+        </w:tc>
+      </w:tr>
+      <w:tr>
+        <w:trPr>
+          <w:cantSplit/>
+        </w:trPr>
+        <w:tc>
+          <w:tcPr>
+            <w:tcW w:type="dxa" w:w="4680"/>
+            <w:vAlign w:val="center"/>
+          </w:tcPr>
+          <w:p>
+            <w:pPr>
+              <w:spacing w:before="40" w:after="40"/>
+              <w:jc w:val="left"/>
+            </w:pPr>
+            <w:r>
+              <w:rPr>
+                <w:sz w:val="19"/>
+              </w:rPr>
+              <w:t>Give the composite one engineering scenario time</w:t>
+            </w:r>
+          </w:p>
+        </w:tc>
+        <w:tc>
+          <w:tcPr>
+            <w:tcW w:type="dxa" w:w="4680"/>
+            <w:vAlign w:val="center"/>
+          </w:tcPr>
+          <w:p>
+            <w:pPr>
+              <w:spacing w:before="40" w:after="40"/>
+              <w:jc w:val="left"/>
+            </w:pPr>
+            <w:r>
+              <w:rPr>
+                <w:sz w:val="19"/>
+              </w:rPr>
+              <w:t>Retain each constituent's controlled time; any composite audit timestamp is administrative and does not affect determination.</w:t>
+            </w:r>
+          </w:p>
+        </w:tc>
+      </w:tr>
     </w:tbl>
     <w:p>
       <w:pPr/>
@@ -23749,13 +23954,13 @@
     <w:p>
       <w:pPr/>
       <w:r>
-        <w:t>After independent acceptance and separate authorisation, bounded implementation affects the validation catalogue/contracts, observed comparison projection, SQLite validation-assurance migration/repository, composite service, validation/evidence read models, review presentation, optional composite export and focused tests. It does not affect topology, outage, restoration, scenario electrical algorithms, controlled configurations, the 15 operational events or the accepted RTM mappings.</w:t>
+        <w:t>After independent acceptance and separate authorisation, bounded implementation affects immutable accepted-catalogue revision preservation, identity-based catalogue/test-definition resolution, validation catalogue/contracts, observed engineering comparison projection, separate provenance gates, SQLite validation-assurance migration/repository, composite service, historical read-only execution enforcement, validation/evidence read models, review presentation, historical/composite export and focused tests. The exact catalogue-package filesystem/repository arrangement remains a bounded implementation choice. No topology, outage, restoration, scenario electrical algorithm, controlled network configuration, 15-event catalogue or RTM mapping changes.</w:t>
       </w:r>
     </w:p>
     <w:p>
       <w:pPr/>
       <w:r>
-        <w:t>Verification covers all nine VT-EXP-ALL-001 and four VT-EXP-ROLE-001 cases, exact-set PASS, constituent FAIL, missing/duplicate/provenance mismatch, independent reviewability, FORMAL-progress isolation, database immutability, export links and deterministic rerun equivalence. Counts remain 24 catalogue tests, 124 requirements and 286 exact RTM relationships.</w:t>
+        <w:t>Verification covers all nine VT-EXP-ALL-001 and four VT-EXP-ROLE-001 cases; exact-set PASS; constituent FAIL; missing/duplicate/provenance mismatch; independent reviewability; FORMAL-progress isolation; database immutability; export links; deterministic rerun equivalence; v1.0 finalised execution review/export after catalogue promotion with original source definition plus separate generation build; a new execution bound to the promoted identity; rejection of unfinished old-catalogue continuation/finalisation; engineering-comparison/provenance separation; and independent constituent scenario times. Counts remain 24 catalogue tests, 124 requirements and 286 exact RTM relationships.</w:t>
       </w:r>
     </w:p>
     <w:p>
@@ -23769,7 +23974,7 @@
     <w:p>
       <w:pPr/>
       <w:r>
-        <w:t>DC-004 remains proposed and does not authorise implementation or resume I9. Machine-readable catalogue/contracts remain at the accepted I8 baseline pending separate acceptance and application.</w:t>
+        <w:t>DC-004 core architecture is accepted in substance, with this bounded correction pending final independent review. It does not authorise implementation or resume I9. Machine-readable catalogue/contracts remain at the accepted I8 baseline pending separate acceptance and controlled application.</w:t>
       </w:r>
     </w:p>
     <w:sectPr>

</xml_diff>

<commit_message>
Accept DC-004 design baseline
</commit_message>
<xml_diff>
--- a/01-engineering-source-documents/OT Project Demonstrator Design.docx
+++ b/01-engineering-source-documents/OT Project Demonstrator Design.docx
@@ -25,9 +25,9 @@
         <w:br/>
         <w:t>Document: OT Project Demonstrator Design</w:t>
         <w:br/>
-        <w:t>Version: 0.3 — Proposed DC-004 controlled revision</w:t>
+        <w:t>Version: 0.3 — Accepted DC-004 controlled revision</w:t>
         <w:br/>
-        <w:t>Status: Draft — DC-004 core accepted in substance; bounded correction pending final independent review; v0.2 remains the accepted baseline</w:t>
+        <w:t>Status: Draft — accepted authoritative design baseline through DC-004; supersedes v0.2</w:t>
       </w:r>
     </w:p>
     <w:p>
@@ -22846,13 +22846,13 @@
         <w:pStyle w:val="Heading1"/>
       </w:pPr>
       <w:r>
-        <w:t>36. Proposed Controlled Amendment — DC-004 Multi-Run Exploratory Validation Determination</w:t>
+        <w:t>36. Accepted Controlled Amendment — DC-004 Multi-Run Exploratory Validation Determination</w:t>
       </w:r>
     </w:p>
     <w:p>
       <w:pPr/>
       <w:r>
-        <w:t>This proposed amendment defines the demonstrator structure needed to determine one multi-run exploratory catalogue test without weakening the accepted one-execution/one-run invariant. It adds stable constituent-case definitions and a separate immutable composite validation-assurance result. It introduces no electrical behaviour, operational event or second validation engine.</w:t>
+        <w:t>This accepted amendment defines the demonstrator structure needed to determine one multi-run exploratory catalogue test without weakening the accepted one-execution/one-run invariant. It adds stable constituent-case definitions and a separate immutable composite validation-assurance result. It introduces no electrical behaviour, operational event or second validation engine.</w:t>
       </w:r>
     </w:p>
     <w:p>
@@ -23954,7 +23954,7 @@
     <w:p>
       <w:pPr/>
       <w:r>
-        <w:t>After independent acceptance and separate authorisation, bounded implementation affects immutable accepted-catalogue revision preservation, identity-based catalogue/test-definition resolution, validation catalogue/contracts, observed engineering comparison projection, separate provenance gates, SQLite validation-assurance migration/repository, composite service, historical read-only execution enforcement, validation/evidence read models, review presentation, historical/composite export and focused tests. The exact catalogue-package filesystem/repository arrangement remains a bounded implementation choice. No topology, outage, restoration, scenario electrical algorithm, controlled network configuration, 15-event catalogue or RTM mapping changes.</w:t>
+        <w:t>After separate application authorisation, bounded implementation affects immutable accepted-catalogue revision preservation, identity-based catalogue/test-definition resolution, validation catalogue/contracts, observed engineering comparison projection, separate provenance gates, SQLite validation-assurance migration/repository, composite service, historical read-only execution enforcement, validation/evidence read models, review presentation, historical/composite export and focused tests. The exact catalogue-package filesystem/repository arrangement remains a bounded implementation choice. No topology, outage, restoration, scenario electrical algorithm, controlled network configuration, 15-event catalogue or RTM mapping changes.</w:t>
       </w:r>
     </w:p>
     <w:p>
@@ -23968,13 +23968,13 @@
         <w:pStyle w:val="Heading2"/>
       </w:pPr>
       <w:r>
-        <w:t>36.8 Proposal Gate</w:t>
+        <w:t>36.8 Accepted Design Gate</w:t>
       </w:r>
     </w:p>
     <w:p>
       <w:pPr/>
       <w:r>
-        <w:t>DC-004 core architecture is accepted in substance, with this bounded correction pending final independent review. It does not authorise implementation or resume I9. Machine-readable catalogue/contracts remain at the accepted I8 baseline pending separate acceptance and controlled application.</w:t>
+        <w:t>DC-004 and Section 36 are accepted as authoritative Demonstrator Design v0.3, superseding v0.2. This acceptance authorises no machine catalogue, contract, schema, database, application or I9 implementation. A separate branch, tests, build identity, independent review and main incorporation are required before I9 resumes.</w:t>
       </w:r>
     </w:p>
     <w:sectPr>

</xml_diff>

<commit_message>
Propose DC-005 validation suspension design
</commit_message>
<xml_diff>
--- a/01-engineering-source-documents/OT Project Demonstrator Design.docx
+++ b/01-engineering-source-documents/OT Project Demonstrator Design.docx
@@ -25,9 +25,9 @@
         <w:br/>
         <w:t>Document: OT Project Demonstrator Design</w:t>
         <w:br/>
-        <w:t>Version: 0.3 — Accepted DC-004 controlled revision</w:t>
+        <w:t>Version: 0.4 — Proposed DC-005 controlled revision</w:t>
         <w:br/>
-        <w:t>Status: Draft — accepted authoritative design baseline through DC-004; supersedes v0.2</w:t>
+        <w:t>Status: Draft — proposed authoritative revision pending independent review; accepted baseline remains v0.3</w:t>
       </w:r>
     </w:p>
     <w:p>
@@ -23975,6 +23975,466 @@
       <w:pPr/>
       <w:r>
         <w:t>DC-004 and Section 36 are accepted as authoritative Demonstrator Design v0.3, superseding v0.2. This acceptance authorises no machine catalogue, contract, schema, database, application or I9 implementation. A separate branch, tests, build identity, independent review and main incorporation are required before I9 resumes.</w:t>
+      </w:r>
+    </w:p>
+    <w:p>
+      <w:pPr>
+        <w:pStyle w:val="Heading1"/>
+      </w:pPr>
+      <w:r>
+        <w:t>37. Proposed Controlled Amendment — DC-005 Suspension Assurance Design</w:t>
+      </w:r>
+    </w:p>
+    <w:p>
+      <w:pPr/>
+      <w:r>
+        <w:t>This proposed amendment translates the Validation Plan DC-005 contract into a bounded application design. It adds no electrical, operational or event behaviour and does not implement the change. ValidationSuspensionRecord is a validation-assurance record owned by Validation/Evidence, never an operational event or substitute for an expected operational BLOCKED result.</w:t>
+      </w:r>
+    </w:p>
+    <w:p>
+      <w:pPr>
+        <w:pStyle w:val="Heading2"/>
+      </w:pPr>
+      <w:r>
+        <w:t>37.1 Data Structures and Relationships</w:t>
+      </w:r>
+    </w:p>
+    <w:tbl>
+      <w:tblPr>
+        <w:tblW w:type="dxa" w:w="9360"/>
+        <w:tblLayout w:type="fixed"/>
+        <w:tblLook w:firstColumn="1" w:firstRow="1" w:lastColumn="0" w:lastRow="0" w:noHBand="0" w:noVBand="1" w:val="04A0"/>
+        <w:jc w:val="left"/>
+        <w:tblInd w:type="dxa" w:w="120"/>
+      </w:tblPr>
+      <w:tblGrid>
+        <w:gridCol w:w="3370"/>
+        <w:gridCol w:w="5990"/>
+      </w:tblGrid>
+      <w:tr>
+        <w:trPr>
+          <w:tblHeader w:val="true"/>
+        </w:trPr>
+        <w:tc>
+          <w:tcPr>
+            <w:tcW w:type="dxa" w:w="3370"/>
+            <w:vAlign w:val="center"/>
+            <w:tcMar>
+              <w:top w:w="80" w:type="dxa"/>
+              <w:start w:w="120" w:type="dxa"/>
+              <w:bottom w:w="80" w:type="dxa"/>
+              <w:end w:w="120" w:type="dxa"/>
+            </w:tcMar>
+            <w:shd w:fill="E7E7E7"/>
+          </w:tcPr>
+          <w:p>
+            <w:r>
+              <w:rPr>
+                <w:b/>
+              </w:rPr>
+              <w:t>Structure</w:t>
+            </w:r>
+          </w:p>
+        </w:tc>
+        <w:tc>
+          <w:tcPr>
+            <w:tcW w:type="dxa" w:w="5990"/>
+            <w:vAlign w:val="center"/>
+            <w:tcMar>
+              <w:top w:w="80" w:type="dxa"/>
+              <w:start w:w="120" w:type="dxa"/>
+              <w:bottom w:w="80" w:type="dxa"/>
+              <w:end w:w="120" w:type="dxa"/>
+            </w:tcMar>
+            <w:shd w:fill="E7E7E7"/>
+          </w:tcPr>
+          <w:p>
+            <w:r>
+              <w:rPr>
+                <w:b/>
+              </w:rPr>
+              <w:t>Ownership and controlled relationship</w:t>
+            </w:r>
+          </w:p>
+        </w:tc>
+      </w:tr>
+      <w:tr>
+        <w:trPr/>
+        <w:tc>
+          <w:tcPr>
+            <w:tcW w:type="dxa" w:w="3370"/>
+            <w:vAlign w:val="center"/>
+            <w:tcMar>
+              <w:top w:w="80" w:type="dxa"/>
+              <w:start w:w="120" w:type="dxa"/>
+              <w:bottom w:w="80" w:type="dxa"/>
+              <w:end w:w="120" w:type="dxa"/>
+            </w:tcMar>
+          </w:tcPr>
+          <w:p>
+            <w:r>
+              <w:t>ValidationSuspensionCondition</w:t>
+            </w:r>
+          </w:p>
+        </w:tc>
+        <w:tc>
+          <w:tcPr>
+            <w:tcW w:type="dxa" w:w="5990"/>
+            <w:vAlign w:val="center"/>
+            <w:tcMar>
+              <w:top w:w="80" w:type="dxa"/>
+              <w:start w:w="120" w:type="dxa"/>
+              <w:bottom w:w="80" w:type="dxa"/>
+              <w:end w:w="120" w:type="dxa"/>
+            </w:tcMar>
+          </w:tcPr>
+          <w:p>
+            <w:r>
+              <w:t>Immutable registry entry for exactly VSC-001–VSC-005, including label, permitted lifecycle, authority mode, evidence-contract version and deterministic reason template.</w:t>
+            </w:r>
+          </w:p>
+        </w:tc>
+      </w:tr>
+      <w:tr>
+        <w:trPr/>
+        <w:tc>
+          <w:tcPr>
+            <w:tcW w:type="dxa" w:w="3370"/>
+            <w:vAlign w:val="center"/>
+            <w:tcMar>
+              <w:top w:w="80" w:type="dxa"/>
+              <w:start w:w="120" w:type="dxa"/>
+              <w:bottom w:w="80" w:type="dxa"/>
+              <w:end w:w="120" w:type="dxa"/>
+            </w:tcMar>
+          </w:tcPr>
+          <w:p>
+            <w:r>
+              <w:t>ValidationSuspensionRecord</w:t>
+            </w:r>
+          </w:p>
+        </w:tc>
+        <w:tc>
+          <w:tcPr>
+            <w:tcW w:type="dxa" w:w="5990"/>
+            <w:vAlign w:val="center"/>
+            <w:tcMar>
+              <w:top w:w="80" w:type="dxa"/>
+              <w:start w:w="120" w:type="dxa"/>
+              <w:bottom w:w="80" w:type="dxa"/>
+              <w:end w:w="120" w:type="dxa"/>
+            </w:tcMar>
+          </w:tcPr>
+          <w:p>
+            <w:r>
+              <w:t>UUID assurance record binding condition, test/case/catalogue/definition/build/input, optional actual run/execution, lifecycle, authority, evidence membership, deterministic reason/fingerprint, class and audit state.</w:t>
+            </w:r>
+          </w:p>
+        </w:tc>
+      </w:tr>
+      <w:tr>
+        <w:trPr/>
+        <w:tc>
+          <w:tcPr>
+            <w:tcW w:type="dxa" w:w="3370"/>
+            <w:vAlign w:val="center"/>
+            <w:tcMar>
+              <w:top w:w="80" w:type="dxa"/>
+              <w:start w:w="120" w:type="dxa"/>
+              <w:bottom w:w="80" w:type="dxa"/>
+              <w:end w:w="120" w:type="dxa"/>
+            </w:tcMar>
+          </w:tcPr>
+          <w:p>
+            <w:r>
+              <w:t>SuspensionEvidenceRecord</w:t>
+            </w:r>
+          </w:p>
+        </w:tc>
+        <w:tc>
+          <w:tcPr>
+            <w:tcW w:type="dxa" w:w="5990"/>
+            <w:vAlign w:val="center"/>
+            <w:tcMar>
+              <w:top w:w="80" w:type="dxa"/>
+              <w:start w:w="120" w:type="dxa"/>
+              <w:bottom w:w="80" w:type="dxa"/>
+              <w:end w:w="120" w:type="dxa"/>
+            </w:tcMar>
+          </w:tcPr>
+          <w:p>
+            <w:r>
+              <w:t>Typed condition-specific evidence with common provenance envelope and canonical payload hash; cannot be attached across incompatible ownership identities.</w:t>
+            </w:r>
+          </w:p>
+        </w:tc>
+      </w:tr>
+      <w:tr>
+        <w:trPr/>
+        <w:tc>
+          <w:tcPr>
+            <w:tcW w:type="dxa" w:w="3370"/>
+            <w:vAlign w:val="center"/>
+            <w:tcMar>
+              <w:top w:w="80" w:type="dxa"/>
+              <w:start w:w="120" w:type="dxa"/>
+              <w:bottom w:w="80" w:type="dxa"/>
+              <w:end w:w="120" w:type="dxa"/>
+            </w:tcMar>
+          </w:tcPr>
+          <w:p>
+            <w:r>
+              <w:t>ValidationExecution</w:t>
+            </w:r>
+          </w:p>
+        </w:tc>
+        <w:tc>
+          <w:tcPr>
+            <w:tcW w:type="dxa" w:w="5990"/>
+            <w:vAlign w:val="center"/>
+            <w:tcMar>
+              <w:top w:w="80" w:type="dxa"/>
+              <w:start w:w="120" w:type="dxa"/>
+              <w:bottom w:w="80" w:type="dxa"/>
+              <w:end w:w="120" w:type="dxa"/>
+            </w:tcMar>
+          </w:tcPr>
+          <w:p>
+            <w:r>
+              <w:t>Completed valid comparison remains PASS/FAIL. When suspension occurs after entry, the execution becomes terminal SUSPENDED, exposes BLOCKED-TEST only through its finalised suspension_record_id and retains prior evidence.</w:t>
+            </w:r>
+          </w:p>
+        </w:tc>
+      </w:tr>
+      <w:tr>
+        <w:trPr/>
+        <w:tc>
+          <w:tcPr>
+            <w:tcW w:type="dxa" w:w="3370"/>
+            <w:vAlign w:val="center"/>
+            <w:tcMar>
+              <w:top w:w="80" w:type="dxa"/>
+              <w:start w:w="120" w:type="dxa"/>
+              <w:bottom w:w="80" w:type="dxa"/>
+              <w:end w:w="120" w:type="dxa"/>
+            </w:tcMar>
+          </w:tcPr>
+          <w:p>
+            <w:r>
+              <w:t>CompositeConstituentLink</w:t>
+            </w:r>
+          </w:p>
+        </w:tc>
+        <w:tc>
+          <w:tcPr>
+            <w:tcW w:type="dxa" w:w="5990"/>
+            <w:vAlign w:val="center"/>
+            <w:tcMar>
+              <w:top w:w="80" w:type="dxa"/>
+              <w:start w:w="120" w:type="dxa"/>
+              <w:bottom w:w="80" w:type="dxa"/>
+              <w:end w:w="120" w:type="dxa"/>
+            </w:tcMar>
+          </w:tcPr>
+          <w:p>
+            <w:r>
+              <w:t>Controlled union of EXECUTION_RESULT (PASS/FAIL) or SUSPENSION_RESULT (BLOCKED-TEST). Pre-entry suspension may omit run/execution only when its lifecycle/evidence proves valid entry failed.</w:t>
+            </w:r>
+          </w:p>
+        </w:tc>
+      </w:tr>
+    </w:tbl>
+    <w:p/>
+    <w:p>
+      <w:pPr>
+        <w:pStyle w:val="Heading2"/>
+      </w:pPr>
+      <w:r>
+        <w:t>37.2 Module, API and Authority Boundaries</w:t>
+      </w:r>
+    </w:p>
+    <w:p>
+      <w:pPr/>
+      <w:r>
+        <w:t>The validation catalogue resolver supplies the bound test/case and historical definition identities. The validation-assurance service owns suspension evaluation, evidence-contract validation, authority checks, deterministic reason generation, finalisation and composite linkage. Existing scenario/topology/outage/restoration modules supply preserved facts only and receive no suspension verdict logic. The evidence-export service packages finalised source records without reconstructing them.</w:t>
+      </w:r>
+    </w:p>
+    <w:p>
+      <w:pPr/>
+      <w:r>
+        <w:t>The public API accepts create/evaluate/finalise suspension operations with condition ID and source references, not verdict or authoritative reason. VSC-001/VSC-002 and pre-entry VSC-004 use graduate-engineer proposal plus a distinct independent-reviewer finalisation. VSC-003, runtime VSC-004 and VSC-005 use backend resolver/verifier authority; the client cannot provide their failure result, hashes, time authority, reason or verdict.</w:t>
+      </w:r>
+    </w:p>
+    <w:p>
+      <w:pPr>
+        <w:pStyle w:val="Heading2"/>
+      </w:pPr>
+      <w:r>
+        <w:t>37.3 Persistence and Atomic Immutability</w:t>
+      </w:r>
+    </w:p>
+    <w:p>
+      <w:pPr/>
+      <w:r>
+        <w:t>SQLite uses separate condition registry, suspension header, evidence membership and reviewer-authority audit records. Finalising a suspension atomically freezes the header, condition, evidence membership and reason; where an execution exists, the same transaction terminally links it as SUSPENDED. Database triggers reject update/delete, condition replacement, evidence insertion/removal/replacement and reclassification. A repeat creates new records. Draft historical-catalogue suspension work is read-only under DC-004.</w:t>
+      </w:r>
+    </w:p>
+    <w:p>
+      <w:pPr>
+        <w:pStyle w:val="Heading2"/>
+      </w:pPr>
+      <w:r>
+        <w:t>37.4 Review Presentation and Progress</w:t>
+      </w:r>
+    </w:p>
+    <w:p>
+      <w:pPr/>
+      <w:r>
+        <w:t>Validation/Evidence shows condition ID/label, lifecycle point, test/case and source definition, build/input identities, actual run/execution where they exist, authority, mandatory evidence checklist, controlled reason/fingerprint, classification and status. PRE_EXECUTION_ENTRY is labelled explicitly and never displays a fabricated run. Optional reviewer notes are visually subordinate to backend-controlled reason semantics.</w:t>
+      </w:r>
+    </w:p>
+    <w:p>
+      <w:pPr/>
+      <w:r>
+        <w:t>The UI offers no BLOCKED-TEST selector. It presents backend-owned eligibility/finalisation actions. FORMAL BLOCKED-TEST totals use finalised FORMAL suspension determinations, while execution totals increase only for real executions. EXPLORATORY suspension/composite records cannot affect FORMAL progress, preserving QA-034.</w:t>
+      </w:r>
+    </w:p>
+    <w:p>
+      <w:pPr>
+        <w:pStyle w:val="Heading2"/>
+      </w:pPr>
+      <w:r>
+        <w:t>37.5 DC-004 Composite and Export Treatment</w:t>
+      </w:r>
+    </w:p>
+    <w:p>
+      <w:pPr/>
+      <w:r>
+        <w:t>The composite read model exposes each case source kind. EXECUTION_RESULT requires immutable execution/run/evidence and PASS/FAIL. SUSPENSION_RESULT requires a finalised condition/evidence/authority record and yields BLOCKED-TEST; actual run/execution identities remain visible when they exist. Composite finalisation re-resolves those sources and never trusts a stored enum alone. Missing or invalid sources remain INCOMPLETE.</w:t>
+      </w:r>
+    </w:p>
+    <w:p>
+      <w:pPr/>
+      <w:r>
+        <w:t>Per-source and composite packages include suspension registry/record/evidence/authority/reason data, linked execution/run where applicable, original catalogue/test/case/build provenance and separate generation build. Package integrity and append-only identity controls remain those accepted under I8/DC-004. No operational event type is added.</w:t>
+      </w:r>
+    </w:p>
+    <w:p>
+      <w:pPr>
+        <w:pStyle w:val="Heading2"/>
+      </w:pPr>
+      <w:r>
+        <w:t>37.6 Implementation Impact, Prohibitions and Gate</w:t>
+      </w:r>
+    </w:p>
+    <w:tbl>
+      <w:tblPr>
+        <w:tblW w:type="dxa" w:w="9360"/>
+        <w:tblLayout w:type="fixed"/>
+        <w:tblLook w:firstColumn="1" w:firstRow="1" w:lastColumn="0" w:lastRow="0" w:noHBand="0" w:noVBand="1" w:val="04A0"/>
+        <w:jc w:val="left"/>
+        <w:tblInd w:type="dxa" w:w="120"/>
+      </w:tblPr>
+      <w:tblGrid>
+        <w:gridCol w:w="4493"/>
+        <w:gridCol w:w="4867"/>
+      </w:tblGrid>
+      <w:tr>
+        <w:trPr>
+          <w:tblHeader w:val="true"/>
+        </w:trPr>
+        <w:tc>
+          <w:tcPr>
+            <w:tcW w:type="dxa" w:w="4493"/>
+            <w:vAlign w:val="center"/>
+            <w:tcMar>
+              <w:top w:w="80" w:type="dxa"/>
+              <w:start w:w="120" w:type="dxa"/>
+              <w:bottom w:w="80" w:type="dxa"/>
+              <w:end w:w="120" w:type="dxa"/>
+            </w:tcMar>
+            <w:shd w:fill="E7E7E7"/>
+          </w:tcPr>
+          <w:p>
+            <w:r>
+              <w:rPr>
+                <w:b/>
+              </w:rPr>
+              <w:t>Permitted future application impact</w:t>
+            </w:r>
+          </w:p>
+        </w:tc>
+        <w:tc>
+          <w:tcPr>
+            <w:tcW w:type="dxa" w:w="4867"/>
+            <w:vAlign w:val="center"/>
+            <w:tcMar>
+              <w:top w:w="80" w:type="dxa"/>
+              <w:start w:w="120" w:type="dxa"/>
+              <w:bottom w:w="80" w:type="dxa"/>
+              <w:end w:w="120" w:type="dxa"/>
+            </w:tcMar>
+            <w:shd w:fill="E7E7E7"/>
+          </w:tcPr>
+          <w:p>
+            <w:r>
+              <w:rPr>
+                <w:b/>
+              </w:rPr>
+              <w:t>Explicitly prohibited</w:t>
+            </w:r>
+          </w:p>
+        </w:tc>
+      </w:tr>
+      <w:tr>
+        <w:trPr/>
+        <w:tc>
+          <w:tcPr>
+            <w:tcW w:type="dxa" w:w="4493"/>
+            <w:vAlign w:val="center"/>
+            <w:tcMar>
+              <w:top w:w="80" w:type="dxa"/>
+              <w:start w:w="120" w:type="dxa"/>
+              <w:bottom w:w="80" w:type="dxa"/>
+              <w:end w:w="120" w:type="dxa"/>
+            </w:tcMar>
+          </w:tcPr>
+          <w:p>
+            <w:r>
+              <w:t>Validation enums/contracts; suspension repository/migration/service; execution terminal relationship; composite union/link validation; API/read model; review UI; export; focused tests.</w:t>
+            </w:r>
+          </w:p>
+        </w:tc>
+        <w:tc>
+          <w:tcPr>
+            <w:tcW w:type="dxa" w:w="4867"/>
+            <w:vAlign w:val="center"/>
+            <w:tcMar>
+              <w:top w:w="80" w:type="dxa"/>
+              <w:start w:w="120" w:type="dxa"/>
+              <w:bottom w:w="80" w:type="dxa"/>
+              <w:end w:w="120" w:type="dxa"/>
+            </w:tcMar>
+          </w:tcPr>
+          <w:p>
+            <w:r>
+              <w:t>Client-selected verdict/reason; arbitrary free-text suspension; unrelated evidence; fictional runs; case-specific verdict rules; operational-event type 16; topology/outage/restoration/DC-003 change; I9 work.</w:t>
+            </w:r>
+          </w:p>
+        </w:tc>
+      </w:tr>
+    </w:tbl>
+    <w:p/>
+    <w:p>
+      <w:pPr/>
+      <w:r>
+        <w:t>Future verification is the exact matrix in Validation Plan Section 20.7 and DC-005 Section 15, including every condition/evidence/authority negative, execution/no-execution lifecycle, composite precedence, immutability, historical export, FORMAL separation and unchanged controlled counts/hashes.</w:t>
+      </w:r>
+    </w:p>
+    <w:p>
+      <w:pPr/>
+      <w:r>
+        <w:t>DC-005 and Section 37 remain proposed. Demonstrator Design v0.3 remains accepted until independent review and controlled application. This proposal does not modify PR #10, apply QA-041/QA-042 or resume I9.</w:t>
       </w:r>
     </w:p>
     <w:sectPr>

</xml_diff>

<commit_message>
Refine DC-005 suspension assurance design
</commit_message>
<xml_diff>
--- a/01-engineering-source-documents/OT Project Demonstrator Design.docx
+++ b/01-engineering-source-documents/OT Project Demonstrator Design.docx
@@ -24090,7 +24090,7 @@
           </w:tcPr>
           <w:p>
             <w:r>
-              <w:t>Immutable registry entry for exactly VSC-001–VSC-005, including label, permitted lifecycle, authority mode, evidence-contract version and deterministic reason template.</w:t>
+              <w:t>Immutable registry for exactly VSC-001–VSC-005 plus versioned non-overlapping classifier gates, authority mode, evidence contract and deterministic reason template.</w:t>
             </w:r>
           </w:p>
         </w:tc>
@@ -24127,7 +24127,7 @@
           </w:tcPr>
           <w:p>
             <w:r>
-              <w:t>UUID assurance record binding condition, test/case/catalogue/definition/build/input, optional actual run/execution, lifecycle, authority, evidence membership, deterministic reason/fingerprint, class and audit state.</w:t>
+              <w:t>UUID assurance record binding validation attempt, trusted target selection, resolved sources, failed-input evidence, distinct target/verifier builds, one classifier result, optional actual run/execution, authority, immutable evidence and reason.</w:t>
             </w:r>
           </w:p>
         </w:tc>
@@ -24184,7 +24184,7 @@
           </w:tcPr>
           <w:p>
             <w:r>
-              <w:t>ValidationExecution</w:t>
+              <w:t>ExecutedValidationResult</w:t>
             </w:r>
           </w:p>
         </w:tc>
@@ -24201,7 +24201,7 @@
           </w:tcPr>
           <w:p>
             <w:r>
-              <w:t>Completed valid comparison remains PASS/FAIL. When suspension occurs after entry, the execution becomes terminal SUSPENDED, exposes BLOCKED-TEST only through its finalised suspension_record_id and retains prior evidence.</w:t>
+              <w:t>Created only after valid expected-versus-observed comparison; stores observed result, sufficient supporting evidence and exactly PASS or FAIL. A suspended attempt has no ExecutedValidationResult.</w:t>
             </w:r>
           </w:p>
         </w:tc>
@@ -24238,7 +24238,29 @@
           </w:tcPr>
           <w:p>
             <w:r>
-              <w:t>Controlled union of EXECUTION_RESULT (PASS/FAIL) or SUSPENSION_RESULT (BLOCKED-TEST). Pre-entry suspension may omit run/execution only when its lifecycle/evidence proves valid entry failed.</w:t>
+              <w:t>Controlled union of EXECUTION_RESULT (PASS/FAIL) or SUSPENSION_RESULT (BLOCKED-TEST). Suspension must resolve a trusted target-selection anchor to the exact required case; client case_id text is insufficient.</w:t>
+            </w:r>
+          </w:p>
+        </w:tc>
+      </w:tr>
+      <w:tr>
+        <w:tc>
+          <w:tcPr>
+            <w:tcW w:type="dxa" w:w="3370"/>
+          </w:tcPr>
+          <w:p>
+            <w:r>
+              <w:t>ValidationAttempt / ValidationTargetSelection</w:t>
+            </w:r>
+          </w:p>
+        </w:tc>
+        <w:tc>
+          <w:tcPr>
+            <w:tcW w:type="dxa" w:w="5990"/>
+          </w:tcPr>
+          <w:p>
+            <w:r>
+              <w:t>Attempt lifecycle plus immutable campaign/test-selection authority, intended test/case/input identities and canonical selection hash; the anchor exists before entry and is separate from successfully resolved source identities.</w:t>
             </w:r>
           </w:p>
         </w:tc>
@@ -24256,13 +24278,13 @@
     <w:p>
       <w:pPr/>
       <w:r>
-        <w:t>The validation catalogue resolver supplies the bound test/case and historical definition identities. The validation-assurance service owns suspension evaluation, evidence-contract validation, authority checks, deterministic reason generation, finalisation and composite linkage. Existing scenario/topology/outage/restoration modules supply preserved facts only and receive no suspension verdict logic. The evidence-export service packages finalised source records without reconstructing them.</w:t>
+        <w:t>A trusted campaign/test-selection resolver creates the immutable ValidationTargetSelection and intended target before entry. The validation-assurance service resolves available source identities, keeps target application and assurance-verifier builds separate, evaluates the versioned single-condition classifier, validates evidence/authority, generates the reason, finalises suspension and supplies DC-004 linkage. Scenario/topology/outage/restoration modules provide preserved facts only. Export packages finalised records without reconstruction.</w:t>
       </w:r>
     </w:p>
     <w:p>
       <w:pPr/>
       <w:r>
-        <w:t>The public API accepts create/evaluate/finalise suspension operations with condition ID and source references, not verdict or authoritative reason. VSC-001/VSC-002 and pre-entry VSC-004 use graduate-engineer proposal plus a distinct independent-reviewer finalisation. VSC-003, runtime VSC-004 and VSC-005 use backend resolver/verifier authority; the client cannot provide their failure result, hashes, time authority, reason or verdict.</w:t>
+        <w:t>The API accepts an evaluation against an existing trusted target_selection_id plus evidence references, not a client-authoritative case ID, verdict or reason. V1 machine-enforces controlled local actor_id/role eligibility, distinct proposal/finalisation actor IDs, audit linkage and immutable finalisation for judgement-based conditions; independent engineering review, not cryptography, asserts real human independence. Backend conditions use resolver/verifier facts the client cannot override.</w:t>
       </w:r>
     </w:p>
     <w:p>
@@ -24276,7 +24298,7 @@
     <w:p>
       <w:pPr/>
       <w:r>
-        <w:t>SQLite uses separate condition registry, suspension header, evidence membership and reviewer-authority audit records. Finalising a suspension atomically freezes the header, condition, evidence membership and reason; where an execution exists, the same transaction terminally links it as SUSPENDED. Database triggers reject update/delete, condition replacement, evidence insertion/removal/replacement and reclassification. A repeat creates new records. Draft historical-catalogue suspension work is read-only under DC-004.</w:t>
+        <w:t>SQLite separates target selections, validation attempts, condition/classifier registry, suspension header, evidence membership and reviewer-authority audit. Finalisation atomically freezes the target anchor, evaluated classifier gates, selected condition, evidence membership and reason; an existing attempt/run context is terminally linked SUSPENDED while no ExecutedValidationResult is created. Triggers reject replacement, late membership or reclassification. Repeats create new identities; historical drafts are read-only.</w:t>
       </w:r>
     </w:p>
     <w:p>
@@ -24290,7 +24312,7 @@
     <w:p>
       <w:pPr/>
       <w:r>
-        <w:t>Validation/Evidence shows condition ID/label, lifecycle point, test/case and source definition, build/input identities, actual run/execution where they exist, authority, mandatory evidence checklist, controlled reason/fingerprint, classification and status. PRE_EXECUTION_ENTRY is labelled explicitly and never displays a fabricated run. Optional reviewer notes are visually subordinate to backend-controlled reason semantics.</w:t>
+        <w:t>Validation/Evidence shows target-selection authority/hash, intended test/case/input, resolved source identities, failed input role/presented evidence, target application build separately from assurance-verifier build, classifier version/gates/selected condition, actual run/execution where present, actor controls, evidence checklist and reason fingerprint. PRE_EXECUTION_ENTRY never displays a fabricated run or implies an ExecutedValidationResult. Optional notes remain subordinate.</w:t>
       </w:r>
     </w:p>
     <w:p>
@@ -24310,7 +24332,7 @@
     <w:p>
       <w:pPr/>
       <w:r>
-        <w:t>The composite read model exposes each case source kind. EXECUTION_RESULT requires immutable execution/run/evidence and PASS/FAIL. SUSPENSION_RESULT requires a finalised condition/evidence/authority record and yields BLOCKED-TEST; actual run/execution identities remain visible when they exist. Composite finalisation re-resolves those sources and never trusts a stored enum alone. Missing or invalid sources remain INCOMPLETE.</w:t>
+        <w:t>The composite read model exposes each case source kind. EXECUTION_RESULT requires immutable ExecutedValidationResult/run/evidence and PASS/FAIL. SUSPENSION_RESULT requires a finalised suspension whose trusted target selection resolves to the exact required case; it never trusts client case_id text or a stored enum. Actual run/execution identities remain visible when present. Missing, unanchored or invalid sources remain INCOMPLETE.</w:t>
       </w:r>
     </w:p>
     <w:p>
@@ -24428,7 +24450,7 @@
     <w:p>
       <w:pPr/>
       <w:r>
-        <w:t>Future verification is the exact matrix in Validation Plan Section 20.7 and DC-005 Section 15, including every condition/evidence/authority negative, execution/no-execution lifecycle, composite precedence, immutability, historical export, FORMAL separation and unchanged controlled counts/hashes.</w:t>
+        <w:t>Future verification is the exact matrix in Validation Plan Section 20.7 and DC-005 Section 15, including clarified attempt/result semantics, deterministic non-overlap, trusted target anchor, target/verifier build separation, actor-control boundary, every evidence/authority negative, composite precedence, immutability, history/export, FORMAL separation and unchanged controlled counts/hashes.</w:t>
       </w:r>
     </w:p>
     <w:p>

</xml_diff>

<commit_message>
Accept DC-005 authoritative design baseline
</commit_message>
<xml_diff>
--- a/01-engineering-source-documents/OT Project Demonstrator Design.docx
+++ b/01-engineering-source-documents/OT Project Demonstrator Design.docx
@@ -25,9 +25,9 @@
         <w:br/>
         <w:t>Document: OT Project Demonstrator Design</w:t>
         <w:br/>
-        <w:t>Version: 0.4 — Proposed DC-005 controlled revision</w:t>
+        <w:t>Version: 0.4</w:t>
         <w:br/>
-        <w:t>Status: Draft — proposed authoritative revision pending independent review; accepted baseline remains v0.3</w:t>
+        <w:t>Status: Draft — accepted authoritative demonstrator-design baseline through DC-005</w:t>
       </w:r>
     </w:p>
     <w:p>
@@ -23982,13 +23982,13 @@
         <w:pStyle w:val="Heading1"/>
       </w:pPr>
       <w:r>
-        <w:t>37. Proposed Controlled Amendment — DC-005 Suspension Assurance Design</w:t>
+        <w:t>37. Accepted Controlled Amendment — DC-005 Suspension Assurance Design</w:t>
       </w:r>
     </w:p>
     <w:p>
       <w:pPr/>
       <w:r>
-        <w:t>This proposed amendment translates the Validation Plan DC-005 contract into a bounded application design. It adds no electrical, operational or event behaviour and does not implement the change. ValidationSuspensionRecord is a validation-assurance record owned by Validation/Evidence, never an operational event or substitute for an expected operational BLOCKED result.</w:t>
+        <w:t>This accepted amendment translates the Validation Plan DC-005 contract into a bounded application design. It adds no electrical, operational or event behaviour and does not implement the change. ValidationSuspensionRecord is a validation-assurance record owned by Validation/Evidence, never an operational event or substitute for an expected operational BLOCKED result.</w:t>
       </w:r>
     </w:p>
     <w:p>
@@ -24456,7 +24456,7 @@
     <w:p>
       <w:pPr/>
       <w:r>
-        <w:t>DC-005 and Section 37 remain proposed. Demonstrator Design v0.3 remains accepted until independent review and controlled application. This proposal does not modify PR #10, apply QA-041/QA-042 or resume I9.</w:t>
+        <w:t>DC-005 and Section 37 are accepted as the authoritative suspension-assurance design, and Demonstrator Design v0.4 supersedes v0.3 as the current demonstrator-design baseline. This design acceptance does not modify PR #10, apply QA-041/QA-042 or resume I9; application requires separate authorisation and independent review.</w:t>
       </w:r>
     </w:p>
     <w:sectPr>

</xml_diff>

<commit_message>
docs: apply accepted DC-006 design
</commit_message>
<xml_diff>
--- a/01-engineering-source-documents/OT Project Demonstrator Design.docx
+++ b/01-engineering-source-documents/OT Project Demonstrator Design.docx
@@ -25,9 +25,9 @@
         <w:br/>
         <w:t>Document: OT Project Demonstrator Design</w:t>
         <w:br/>
-        <w:t>Version: 0.4</w:t>
+        <w:t>Version: 0.5 (proposed)</w:t>
         <w:br/>
-        <w:t>Status: Draft — accepted authoritative demonstrator-design baseline through DC-005</w:t>
+        <w:t>Status: Draft — DC-006 authoritative-document application pending independent review; accepted baseline remains Demonstrator Design v0.4</w:t>
       </w:r>
     </w:p>
     <w:p>
@@ -24457,6 +24457,1751 @@
       <w:pPr/>
       <w:r>
         <w:t>DC-005 and Section 37 are accepted as the authoritative suspension-assurance design, and Demonstrator Design v0.4 supersedes v0.3 as the current demonstrator-design baseline. This design acceptance does not modify PR #10, apply QA-041/QA-042 or resume I9; application requires separate authorisation and independent review.</w:t>
+      </w:r>
+    </w:p>
+    <w:p>
+      <w:r>
+        <w:br w:type="page"/>
+      </w:r>
+    </w:p>
+    <w:p>
+      <w:pPr>
+        <w:pStyle w:val="Heading1"/>
+      </w:pPr>
+      <w:r>
+        <w:t>38. Proposed Controlled Amendment — DC-006 Determination Demonstrator Design</w:t>
+      </w:r>
+    </w:p>
+    <w:p>
+      <w:r>
+        <w:t>This proposed Section 38 defines the application structures required to implement the accepted DC-006 design in a future separately authorised phase. It changes validation-assurance design only. Demonstrator Design v0.4 remains accepted until this proposed v0.5 application is independently reviewed and accepted.</w:t>
+      </w:r>
+    </w:p>
+    <w:p>
+      <w:pPr>
+        <w:pStyle w:val="Heading2"/>
+      </w:pPr>
+      <w:r>
+        <w:t>38.1 Contracts and Information Separation</w:t>
+      </w:r>
+    </w:p>
+    <w:tbl>
+      <w:tblPr>
+        <w:tblW w:type="dxa" w:w="9360"/>
+        <w:jc w:val="center"/>
+        <w:tblLayout w:type="fixed"/>
+        <w:tblLook w:firstColumn="1" w:firstRow="1" w:lastColumn="0" w:lastRow="0" w:noHBand="0" w:noVBand="1" w:val="04A0"/>
+        <w:tblInd w:type="dxa" w:w="120"/>
+        <w:tblBorders>
+          <w:top w:val="single" w:sz="6" w:color="B7B7B7"/>
+          <w:left w:val="single" w:sz="6" w:color="B7B7B7"/>
+          <w:bottom w:val="single" w:sz="6" w:color="B7B7B7"/>
+          <w:right w:val="single" w:sz="6" w:color="B7B7B7"/>
+          <w:insideH w:val="single" w:sz="6" w:color="B7B7B7"/>
+          <w:insideV w:val="single" w:sz="6" w:color="B7B7B7"/>
+        </w:tblBorders>
+      </w:tblPr>
+      <w:tblGrid>
+        <w:gridCol w:w="2100"/>
+        <w:gridCol w:w="7260"/>
+      </w:tblGrid>
+      <w:tr>
+        <w:trPr>
+          <w:tblHeader w:val="true"/>
+        </w:trPr>
+        <w:tc>
+          <w:tcPr>
+            <w:tcW w:type="dxa" w:w="2100"/>
+            <w:shd w:fill="D9EAF7"/>
+            <w:vAlign w:val="center"/>
+            <w:tcMar>
+              <w:top w:w="90" w:type="dxa"/>
+              <w:left w:w="90" w:type="dxa"/>
+              <w:bottom w:w="90" w:type="dxa"/>
+              <w:right w:w="90" w:type="dxa"/>
+            </w:tcMar>
+          </w:tcPr>
+          <w:p>
+            <w:pPr>
+              <w:spacing w:before="0" w:after="40" w:line="240" w:lineRule="auto"/>
+            </w:pPr>
+            <w:r>
+              <w:rPr>
+                <w:b/>
+                <w:sz w:val="17"/>
+              </w:rPr>
+              <w:t>Controlled field</w:t>
+            </w:r>
+          </w:p>
+        </w:tc>
+        <w:tc>
+          <w:tcPr>
+            <w:tcW w:type="dxa" w:w="7260"/>
+            <w:shd w:fill="D9EAF7"/>
+            <w:vAlign w:val="center"/>
+            <w:tcMar>
+              <w:top w:w="90" w:type="dxa"/>
+              <w:left w:w="90" w:type="dxa"/>
+              <w:bottom w:w="90" w:type="dxa"/>
+              <w:right w:w="90" w:type="dxa"/>
+            </w:tcMar>
+          </w:tcPr>
+          <w:p>
+            <w:pPr>
+              <w:spacing w:before="0" w:after="40" w:line="240" w:lineRule="auto"/>
+            </w:pPr>
+            <w:r>
+              <w:rPr>
+                <w:b/>
+                <w:sz w:val="17"/>
+              </w:rPr>
+              <w:t>Authoritative value / rule</w:t>
+            </w:r>
+          </w:p>
+        </w:tc>
+      </w:tr>
+      <w:tr>
+        <w:tc>
+          <w:tcPr>
+            <w:tcW w:type="dxa" w:w="2100"/>
+            <w:vAlign w:val="center"/>
+            <w:tcMar>
+              <w:top w:w="90" w:type="dxa"/>
+              <w:left w:w="90" w:type="dxa"/>
+              <w:bottom w:w="90" w:type="dxa"/>
+              <w:right w:w="90" w:type="dxa"/>
+            </w:tcMar>
+          </w:tcPr>
+          <w:p>
+            <w:pPr>
+              <w:spacing w:before="0" w:after="40" w:line="240" w:lineRule="auto"/>
+            </w:pPr>
+            <w:r>
+              <w:rPr>
+                <w:sz w:val="17"/>
+              </w:rPr>
+              <w:t>DeterminationMethodDefinition</w:t>
+            </w:r>
+          </w:p>
+        </w:tc>
+        <w:tc>
+          <w:tcPr>
+            <w:tcW w:type="dxa" w:w="7260"/>
+            <w:vAlign w:val="center"/>
+            <w:tcMar>
+              <w:top w:w="90" w:type="dxa"/>
+              <w:left w:w="90" w:type="dxa"/>
+              <w:bottom w:w="90" w:type="dxa"/>
+              <w:right w:w="90" w:type="dxa"/>
+            </w:tcMar>
+          </w:tcPr>
+          <w:p>
+            <w:pPr>
+              <w:spacing w:before="0" w:after="40" w:line="240" w:lineRule="auto"/>
+            </w:pPr>
+            <w:r>
+              <w:rPr>
+                <w:sz w:val="17"/>
+              </w:rPr>
+              <w:t>Immutable Validation Catalogue data: method ID/version/hash; test/optional case; evidence class; context kind; exact roles/checkpoints; criterion set; aggregate; source references; derived coverage.</w:t>
+            </w:r>
+          </w:p>
+        </w:tc>
+      </w:tr>
+      <w:tr>
+        <w:tc>
+          <w:tcPr>
+            <w:tcW w:type="dxa" w:w="2100"/>
+            <w:vAlign w:val="center"/>
+            <w:tcMar>
+              <w:top w:w="90" w:type="dxa"/>
+              <w:left w:w="90" w:type="dxa"/>
+              <w:bottom w:w="90" w:type="dxa"/>
+              <w:right w:w="90" w:type="dxa"/>
+            </w:tcMar>
+          </w:tcPr>
+          <w:p>
+            <w:pPr>
+              <w:spacing w:before="0" w:after="40" w:line="240" w:lineRule="auto"/>
+            </w:pPr>
+            <w:r>
+              <w:rPr>
+                <w:sz w:val="17"/>
+              </w:rPr>
+              <w:t>CriterionDefinition</w:t>
+            </w:r>
+          </w:p>
+        </w:tc>
+        <w:tc>
+          <w:tcPr>
+            <w:tcW w:type="dxa" w:w="7260"/>
+            <w:vAlign w:val="center"/>
+            <w:tcMar>
+              <w:top w:w="90" w:type="dxa"/>
+              <w:left w:w="90" w:type="dxa"/>
+              <w:bottom w:w="90" w:type="dxa"/>
+              <w:right w:w="90" w:type="dxa"/>
+            </w:tcMar>
+          </w:tcPr>
+          <w:p>
+            <w:pPr>
+              <w:spacing w:before="0" w:after="40" w:line="240" w:lineRule="auto"/>
+            </w:pPr>
+            <w:r>
+              <w:rPr>
+                <w:sz w:val="17"/>
+              </w:rPr>
+              <w:t>Immutable definition: ID/version/hash; kind; parent/optional case; context/checkpoint; expected value or proposition; source selector; operator/normalisation; evidence roles; requirement_ids.</w:t>
+            </w:r>
+          </w:p>
+        </w:tc>
+      </w:tr>
+      <w:tr>
+        <w:tc>
+          <w:tcPr>
+            <w:tcW w:type="dxa" w:w="2100"/>
+            <w:vAlign w:val="center"/>
+            <w:tcMar>
+              <w:top w:w="90" w:type="dxa"/>
+              <w:left w:w="90" w:type="dxa"/>
+              <w:bottom w:w="90" w:type="dxa"/>
+              <w:right w:w="90" w:type="dxa"/>
+            </w:tcMar>
+          </w:tcPr>
+          <w:p>
+            <w:pPr>
+              <w:spacing w:before="0" w:after="40" w:line="240" w:lineRule="auto"/>
+            </w:pPr>
+            <w:r>
+              <w:rPr>
+                <w:sz w:val="17"/>
+              </w:rPr>
+              <w:t>DeterminationContext</w:t>
+            </w:r>
+          </w:p>
+        </w:tc>
+        <w:tc>
+          <w:tcPr>
+            <w:tcW w:type="dxa" w:w="7260"/>
+            <w:vAlign w:val="center"/>
+            <w:tcMar>
+              <w:top w:w="90" w:type="dxa"/>
+              <w:left w:w="90" w:type="dxa"/>
+              <w:bottom w:w="90" w:type="dxa"/>
+              <w:right w:w="90" w:type="dxa"/>
+            </w:tcMar>
+          </w:tcPr>
+          <w:p>
+            <w:pPr>
+              <w:spacing w:before="0" w:after="40" w:line="240" w:lineRule="auto"/>
+            </w:pPr>
+            <w:r>
+              <w:rPr>
+                <w:sz w:val="17"/>
+              </w:rPr>
+              <w:t>Immutable header plus exactly one typed binding: scenario execution, fixture execution, preserved record set or engineering review. Composite parents own none.</w:t>
+            </w:r>
+          </w:p>
+        </w:tc>
+      </w:tr>
+      <w:tr>
+        <w:tc>
+          <w:tcPr>
+            <w:tcW w:type="dxa" w:w="2100"/>
+            <w:vAlign w:val="center"/>
+            <w:tcMar>
+              <w:top w:w="90" w:type="dxa"/>
+              <w:left w:w="90" w:type="dxa"/>
+              <w:bottom w:w="90" w:type="dxa"/>
+              <w:right w:w="90" w:type="dxa"/>
+            </w:tcMar>
+          </w:tcPr>
+          <w:p>
+            <w:pPr>
+              <w:spacing w:before="0" w:after="40" w:line="240" w:lineRule="auto"/>
+            </w:pPr>
+            <w:r>
+              <w:rPr>
+                <w:sz w:val="17"/>
+              </w:rPr>
+              <w:t>CriterionFinding</w:t>
+            </w:r>
+          </w:p>
+        </w:tc>
+        <w:tc>
+          <w:tcPr>
+            <w:tcW w:type="dxa" w:w="7260"/>
+            <w:vAlign w:val="center"/>
+            <w:tcMar>
+              <w:top w:w="90" w:type="dxa"/>
+              <w:left w:w="90" w:type="dxa"/>
+              <w:bottom w:w="90" w:type="dxa"/>
+              <w:right w:w="90" w:type="dxa"/>
+            </w:tcMar>
+          </w:tcPr>
+          <w:p>
+            <w:pPr>
+              <w:spacing w:before="0" w:after="40" w:line="240" w:lineRule="auto"/>
+            </w:pPr>
+            <w:r>
+              <w:rPr>
+                <w:sz w:val="17"/>
+              </w:rPr>
+              <w:t>Immutable expected/observed or reviewer finding with source/evidence/provenance, NOT_EVALUATED/SATISFIED/NOT_SATISFIED, reason and hash.</w:t>
+            </w:r>
+          </w:p>
+        </w:tc>
+      </w:tr>
+      <w:tr>
+        <w:tc>
+          <w:tcPr>
+            <w:tcW w:type="dxa" w:w="2100"/>
+            <w:vAlign w:val="center"/>
+            <w:tcMar>
+              <w:top w:w="90" w:type="dxa"/>
+              <w:left w:w="90" w:type="dxa"/>
+              <w:bottom w:w="90" w:type="dxa"/>
+              <w:right w:w="90" w:type="dxa"/>
+            </w:tcMar>
+          </w:tcPr>
+          <w:p>
+            <w:pPr>
+              <w:spacing w:before="0" w:after="40" w:line="240" w:lineRule="auto"/>
+            </w:pPr>
+            <w:r>
+              <w:rPr>
+                <w:sz w:val="17"/>
+              </w:rPr>
+              <w:t>ExecutedValidationResult</w:t>
+            </w:r>
+          </w:p>
+        </w:tc>
+        <w:tc>
+          <w:tcPr>
+            <w:tcW w:type="dxa" w:w="7260"/>
+            <w:vAlign w:val="center"/>
+            <w:tcMar>
+              <w:top w:w="90" w:type="dxa"/>
+              <w:left w:w="90" w:type="dxa"/>
+              <w:bottom w:w="90" w:type="dxa"/>
+              <w:right w:w="90" w:type="dxa"/>
+            </w:tcMar>
+          </w:tcPr>
+          <w:p>
+            <w:pPr>
+              <w:spacing w:before="0" w:after="40" w:line="240" w:lineRule="auto"/>
+            </w:pPr>
+            <w:r>
+              <w:rPr>
+                <w:sz w:val="17"/>
+              </w:rPr>
+              <w:t>Existing PASS/FAIL result created only by backend deterministic aggregate for a complete non-composite/case execution.</w:t>
+            </w:r>
+          </w:p>
+        </w:tc>
+      </w:tr>
+      <w:tr>
+        <w:tc>
+          <w:tcPr>
+            <w:tcW w:type="dxa" w:w="2100"/>
+            <w:vAlign w:val="center"/>
+            <w:tcMar>
+              <w:top w:w="90" w:type="dxa"/>
+              <w:left w:w="90" w:type="dxa"/>
+              <w:bottom w:w="90" w:type="dxa"/>
+              <w:right w:w="90" w:type="dxa"/>
+            </w:tcMar>
+          </w:tcPr>
+          <w:p>
+            <w:pPr>
+              <w:spacing w:before="0" w:after="40" w:line="240" w:lineRule="auto"/>
+            </w:pPr>
+            <w:r>
+              <w:rPr>
+                <w:sz w:val="17"/>
+              </w:rPr>
+              <w:t>CompositeValidationResult</w:t>
+            </w:r>
+          </w:p>
+        </w:tc>
+        <w:tc>
+          <w:tcPr>
+            <w:tcW w:type="dxa" w:w="7260"/>
+            <w:vAlign w:val="center"/>
+            <w:tcMar>
+              <w:top w:w="90" w:type="dxa"/>
+              <w:left w:w="90" w:type="dxa"/>
+              <w:bottom w:w="90" w:type="dxa"/>
+              <w:right w:w="90" w:type="dxa"/>
+            </w:tcMar>
+          </w:tcPr>
+          <w:p>
+            <w:pPr>
+              <w:spacing w:before="0" w:after="40" w:line="240" w:lineRule="auto"/>
+            </w:pPr>
+            <w:r>
+              <w:rPr>
+                <w:sz w:val="17"/>
+              </w:rPr>
+              <w:t>Existing DC-004 parent result over exact constituent sources; remains separate from execution/result records.</w:t>
+            </w:r>
+          </w:p>
+        </w:tc>
+      </w:tr>
+      <w:tr>
+        <w:tc>
+          <w:tcPr>
+            <w:tcW w:type="dxa" w:w="2100"/>
+            <w:vAlign w:val="center"/>
+            <w:tcMar>
+              <w:top w:w="90" w:type="dxa"/>
+              <w:left w:w="90" w:type="dxa"/>
+              <w:bottom w:w="90" w:type="dxa"/>
+              <w:right w:w="90" w:type="dxa"/>
+            </w:tcMar>
+          </w:tcPr>
+          <w:p>
+            <w:pPr>
+              <w:spacing w:before="0" w:after="40" w:line="240" w:lineRule="auto"/>
+            </w:pPr>
+            <w:r>
+              <w:rPr>
+                <w:sz w:val="17"/>
+              </w:rPr>
+              <w:t>ValidationSuspensionRecord</w:t>
+            </w:r>
+          </w:p>
+        </w:tc>
+        <w:tc>
+          <w:tcPr>
+            <w:tcW w:type="dxa" w:w="7260"/>
+            <w:vAlign w:val="center"/>
+            <w:tcMar>
+              <w:top w:w="90" w:type="dxa"/>
+              <w:left w:w="90" w:type="dxa"/>
+              <w:bottom w:w="90" w:type="dxa"/>
+              <w:right w:w="90" w:type="dxa"/>
+            </w:tcMar>
+          </w:tcPr>
+          <w:p>
+            <w:pPr>
+              <w:spacing w:before="0" w:after="40" w:line="240" w:lineRule="auto"/>
+            </w:pPr>
+            <w:r>
+              <w:rPr>
+                <w:sz w:val="17"/>
+              </w:rPr>
+              <w:t>Existing DC-005 BLOCKED-TEST source; no PASS/FAIL result; remains separate from engineering operational BLOCKED.</w:t>
+            </w:r>
+          </w:p>
+        </w:tc>
+      </w:tr>
+    </w:tbl>
+    <w:p>
+      <w:pPr>
+        <w:pStyle w:val="Heading2"/>
+      </w:pPr>
+      <w:r>
+        <w:t>38.2 Module Ownership and Generic Adapters</w:t>
+      </w:r>
+    </w:p>
+    <w:tbl>
+      <w:tblPr>
+        <w:tblW w:type="dxa" w:w="9360"/>
+        <w:jc w:val="center"/>
+        <w:tblLayout w:type="fixed"/>
+        <w:tblLook w:firstColumn="1" w:firstRow="1" w:lastColumn="0" w:lastRow="0" w:noHBand="0" w:noVBand="1" w:val="04A0"/>
+        <w:tblInd w:type="dxa" w:w="120"/>
+        <w:tblBorders>
+          <w:top w:val="single" w:sz="6" w:color="B7B7B7"/>
+          <w:left w:val="single" w:sz="6" w:color="B7B7B7"/>
+          <w:bottom w:val="single" w:sz="6" w:color="B7B7B7"/>
+          <w:right w:val="single" w:sz="6" w:color="B7B7B7"/>
+          <w:insideH w:val="single" w:sz="6" w:color="B7B7B7"/>
+          <w:insideV w:val="single" w:sz="6" w:color="B7B7B7"/>
+        </w:tblBorders>
+      </w:tblPr>
+      <w:tblGrid>
+        <w:gridCol w:w="2100"/>
+        <w:gridCol w:w="7260"/>
+      </w:tblGrid>
+      <w:tr>
+        <w:trPr>
+          <w:tblHeader w:val="true"/>
+        </w:trPr>
+        <w:tc>
+          <w:tcPr>
+            <w:tcW w:type="dxa" w:w="2100"/>
+            <w:shd w:fill="D9EAF7"/>
+            <w:vAlign w:val="center"/>
+            <w:tcMar>
+              <w:top w:w="90" w:type="dxa"/>
+              <w:left w:w="90" w:type="dxa"/>
+              <w:bottom w:w="90" w:type="dxa"/>
+              <w:right w:w="90" w:type="dxa"/>
+            </w:tcMar>
+          </w:tcPr>
+          <w:p>
+            <w:pPr>
+              <w:spacing w:before="0" w:after="40" w:line="240" w:lineRule="auto"/>
+            </w:pPr>
+            <w:r>
+              <w:rPr>
+                <w:b/>
+                <w:sz w:val="17"/>
+              </w:rPr>
+              <w:t>Controlled field</w:t>
+            </w:r>
+          </w:p>
+        </w:tc>
+        <w:tc>
+          <w:tcPr>
+            <w:tcW w:type="dxa" w:w="7260"/>
+            <w:shd w:fill="D9EAF7"/>
+            <w:vAlign w:val="center"/>
+            <w:tcMar>
+              <w:top w:w="90" w:type="dxa"/>
+              <w:left w:w="90" w:type="dxa"/>
+              <w:bottom w:w="90" w:type="dxa"/>
+              <w:right w:w="90" w:type="dxa"/>
+            </w:tcMar>
+          </w:tcPr>
+          <w:p>
+            <w:pPr>
+              <w:spacing w:before="0" w:after="40" w:line="240" w:lineRule="auto"/>
+            </w:pPr>
+            <w:r>
+              <w:rPr>
+                <w:b/>
+                <w:sz w:val="17"/>
+              </w:rPr>
+              <w:t>Authoritative value / rule</w:t>
+            </w:r>
+          </w:p>
+        </w:tc>
+      </w:tr>
+      <w:tr>
+        <w:tc>
+          <w:tcPr>
+            <w:tcW w:type="dxa" w:w="2100"/>
+            <w:vAlign w:val="center"/>
+            <w:tcMar>
+              <w:top w:w="90" w:type="dxa"/>
+              <w:left w:w="90" w:type="dxa"/>
+              <w:bottom w:w="90" w:type="dxa"/>
+              <w:right w:w="90" w:type="dxa"/>
+            </w:tcMar>
+          </w:tcPr>
+          <w:p>
+            <w:pPr>
+              <w:spacing w:before="0" w:after="40" w:line="240" w:lineRule="auto"/>
+            </w:pPr>
+            <w:r>
+              <w:rPr>
+                <w:sz w:val="17"/>
+              </w:rPr>
+              <w:t>validation</w:t>
+            </w:r>
+          </w:p>
+        </w:tc>
+        <w:tc>
+          <w:tcPr>
+            <w:tcW w:type="dxa" w:w="7260"/>
+            <w:vAlign w:val="center"/>
+            <w:tcMar>
+              <w:top w:w="90" w:type="dxa"/>
+              <w:left w:w="90" w:type="dxa"/>
+              <w:bottom w:w="90" w:type="dxa"/>
+              <w:right w:w="90" w:type="dxa"/>
+            </w:tcMar>
+          </w:tcPr>
+          <w:p>
+            <w:pPr>
+              <w:spacing w:before="0" w:after="40" w:line="240" w:lineRule="auto"/>
+            </w:pPr>
+            <w:r>
+              <w:rPr>
+                <w:sz w:val="17"/>
+              </w:rPr>
+              <w:t>Loads/resolves method/criterion definitions and historical Validation Catalogue revisions; validates exact direct/case coverage; binds contexts; evaluates findings; derives direct results.</w:t>
+            </w:r>
+          </w:p>
+        </w:tc>
+      </w:tr>
+      <w:tr>
+        <w:tc>
+          <w:tcPr>
+            <w:tcW w:type="dxa" w:w="2100"/>
+            <w:vAlign w:val="center"/>
+            <w:tcMar>
+              <w:top w:w="90" w:type="dxa"/>
+              <w:left w:w="90" w:type="dxa"/>
+              <w:bottom w:w="90" w:type="dxa"/>
+              <w:right w:w="90" w:type="dxa"/>
+            </w:tcMar>
+          </w:tcPr>
+          <w:p>
+            <w:pPr>
+              <w:spacing w:before="0" w:after="40" w:line="240" w:lineRule="auto"/>
+            </w:pPr>
+            <w:r>
+              <w:rPr>
+                <w:sz w:val="17"/>
+              </w:rPr>
+              <w:t>scenario/topology/outage/telemetry/restoration/events</w:t>
+            </w:r>
+          </w:p>
+        </w:tc>
+        <w:tc>
+          <w:tcPr>
+            <w:tcW w:type="dxa" w:w="7260"/>
+            <w:vAlign w:val="center"/>
+            <w:tcMar>
+              <w:top w:w="90" w:type="dxa"/>
+              <w:left w:w="90" w:type="dxa"/>
+              <w:bottom w:w="90" w:type="dxa"/>
+              <w:right w:w="90" w:type="dxa"/>
+            </w:tcMar>
+          </w:tcPr>
+          <w:p>
+            <w:pPr>
+              <w:spacing w:before="0" w:after="40" w:line="240" w:lineRule="auto"/>
+            </w:pPr>
+            <w:r>
+              <w:rPr>
+                <w:sz w:val="17"/>
+              </w:rPr>
+              <w:t>Remain exclusive engineering/operational authorities and expose preserved typed records through read-only adapter contracts.</w:t>
+            </w:r>
+          </w:p>
+        </w:tc>
+      </w:tr>
+      <w:tr>
+        <w:tc>
+          <w:tcPr>
+            <w:tcW w:type="dxa" w:w="2100"/>
+            <w:vAlign w:val="center"/>
+            <w:tcMar>
+              <w:top w:w="90" w:type="dxa"/>
+              <w:left w:w="90" w:type="dxa"/>
+              <w:bottom w:w="90" w:type="dxa"/>
+              <w:right w:w="90" w:type="dxa"/>
+            </w:tcMar>
+          </w:tcPr>
+          <w:p>
+            <w:pPr>
+              <w:spacing w:before="0" w:after="40" w:line="240" w:lineRule="auto"/>
+            </w:pPr>
+            <w:r>
+              <w:rPr>
+                <w:sz w:val="17"/>
+              </w:rPr>
+              <w:t>validation_assurance</w:t>
+            </w:r>
+          </w:p>
+        </w:tc>
+        <w:tc>
+          <w:tcPr>
+            <w:tcW w:type="dxa" w:w="7260"/>
+            <w:vAlign w:val="center"/>
+            <w:tcMar>
+              <w:top w:w="90" w:type="dxa"/>
+              <w:left w:w="90" w:type="dxa"/>
+              <w:bottom w:w="90" w:type="dxa"/>
+              <w:right w:w="90" w:type="dxa"/>
+            </w:tcMar>
+          </w:tcPr>
+          <w:p>
+            <w:pPr>
+              <w:spacing w:before="0" w:after="40" w:line="240" w:lineRule="auto"/>
+            </w:pPr>
+            <w:r>
+              <w:rPr>
+                <w:sz w:val="17"/>
+              </w:rPr>
+              <w:t>Owns reviewer proposal/finalisation controls, completeness diagnostics, DC-004 composite coordination and DC-005 integration without replacing either accepted engine.</w:t>
+            </w:r>
+          </w:p>
+        </w:tc>
+      </w:tr>
+      <w:tr>
+        <w:tc>
+          <w:tcPr>
+            <w:tcW w:type="dxa" w:w="2100"/>
+            <w:vAlign w:val="center"/>
+            <w:tcMar>
+              <w:top w:w="90" w:type="dxa"/>
+              <w:left w:w="90" w:type="dxa"/>
+              <w:bottom w:w="90" w:type="dxa"/>
+              <w:right w:w="90" w:type="dxa"/>
+            </w:tcMar>
+          </w:tcPr>
+          <w:p>
+            <w:pPr>
+              <w:spacing w:before="0" w:after="40" w:line="240" w:lineRule="auto"/>
+            </w:pPr>
+            <w:r>
+              <w:rPr>
+                <w:sz w:val="17"/>
+              </w:rPr>
+              <w:t>evidence_export</w:t>
+            </w:r>
+          </w:p>
+        </w:tc>
+        <w:tc>
+          <w:tcPr>
+            <w:tcW w:type="dxa" w:w="7260"/>
+            <w:vAlign w:val="center"/>
+            <w:tcMar>
+              <w:top w:w="90" w:type="dxa"/>
+              <w:left w:w="90" w:type="dxa"/>
+              <w:bottom w:w="90" w:type="dxa"/>
+              <w:right w:w="90" w:type="dxa"/>
+            </w:tcMar>
+          </w:tcPr>
+          <w:p>
+            <w:pPr>
+              <w:spacing w:before="0" w:after="40" w:line="240" w:lineRule="auto"/>
+            </w:pPr>
+            <w:r>
+              <w:rPr>
+                <w:sz w:val="17"/>
+              </w:rPr>
+              <w:t>Packages source definition, context, criteria, findings, requirement/evidence links, direct/composite/suspension source chains and separate source/generation build identities.</w:t>
+            </w:r>
+          </w:p>
+        </w:tc>
+      </w:tr>
+      <w:tr>
+        <w:tc>
+          <w:tcPr>
+            <w:tcW w:type="dxa" w:w="2100"/>
+            <w:vAlign w:val="center"/>
+            <w:tcMar>
+              <w:top w:w="90" w:type="dxa"/>
+              <w:left w:w="90" w:type="dxa"/>
+              <w:bottom w:w="90" w:type="dxa"/>
+              <w:right w:w="90" w:type="dxa"/>
+            </w:tcMar>
+          </w:tcPr>
+          <w:p>
+            <w:pPr>
+              <w:spacing w:before="0" w:after="40" w:line="240" w:lineRule="auto"/>
+            </w:pPr>
+            <w:r>
+              <w:rPr>
+                <w:sz w:val="17"/>
+              </w:rPr>
+              <w:t>workspace/API/frontend</w:t>
+            </w:r>
+          </w:p>
+        </w:tc>
+        <w:tc>
+          <w:tcPr>
+            <w:tcW w:type="dxa" w:w="7260"/>
+            <w:vAlign w:val="center"/>
+            <w:tcMar>
+              <w:top w:w="90" w:type="dxa"/>
+              <w:left w:w="90" w:type="dxa"/>
+              <w:bottom w:w="90" w:type="dxa"/>
+              <w:right w:w="90" w:type="dxa"/>
+            </w:tcMar>
+          </w:tcPr>
+          <w:p>
+            <w:pPr>
+              <w:spacing w:before="0" w:after="40" w:line="240" w:lineRule="auto"/>
+            </w:pPr>
+            <w:r>
+              <w:rPr>
+                <w:sz w:val="17"/>
+              </w:rPr>
+              <w:t>Presents backend-owned projections/actions. It never selects source values, applies operators, judges reviewer propositions, totals coverage or chooses a verdict.</w:t>
+            </w:r>
+          </w:p>
+        </w:tc>
+      </w:tr>
+    </w:tbl>
+    <w:p>
+      <w:r>
+        <w:t>The adapter registry is typed and versioned. Selectors address actual preserved backend records; operators are generic. No production branch may return an observed value or verdict by test_id, case_id, section ID, Network Configuration version or expected-outcome lookup.</w:t>
+      </w:r>
+    </w:p>
+    <w:p>
+      <w:pPr>
+        <w:pStyle w:val="Heading2"/>
+      </w:pPr>
+      <w:r>
+        <w:t>38.3 Persistence and Atomic Immutability</w:t>
+      </w:r>
+    </w:p>
+    <w:tbl>
+      <w:tblPr>
+        <w:tblW w:type="dxa" w:w="9360"/>
+        <w:jc w:val="center"/>
+        <w:tblLayout w:type="fixed"/>
+        <w:tblLook w:firstColumn="1" w:firstRow="1" w:lastColumn="0" w:lastRow="0" w:noHBand="0" w:noVBand="1" w:val="04A0"/>
+        <w:tblInd w:type="dxa" w:w="120"/>
+        <w:tblBorders>
+          <w:top w:val="single" w:sz="6" w:color="B7B7B7"/>
+          <w:left w:val="single" w:sz="6" w:color="B7B7B7"/>
+          <w:bottom w:val="single" w:sz="6" w:color="B7B7B7"/>
+          <w:right w:val="single" w:sz="6" w:color="B7B7B7"/>
+          <w:insideH w:val="single" w:sz="6" w:color="B7B7B7"/>
+          <w:insideV w:val="single" w:sz="6" w:color="B7B7B7"/>
+        </w:tblBorders>
+      </w:tblPr>
+      <w:tblGrid>
+        <w:gridCol w:w="2100"/>
+        <w:gridCol w:w="7260"/>
+      </w:tblGrid>
+      <w:tr>
+        <w:trPr>
+          <w:tblHeader w:val="true"/>
+        </w:trPr>
+        <w:tc>
+          <w:tcPr>
+            <w:tcW w:type="dxa" w:w="2100"/>
+            <w:shd w:fill="D9EAF7"/>
+            <w:vAlign w:val="center"/>
+            <w:tcMar>
+              <w:top w:w="90" w:type="dxa"/>
+              <w:left w:w="90" w:type="dxa"/>
+              <w:bottom w:w="90" w:type="dxa"/>
+              <w:right w:w="90" w:type="dxa"/>
+            </w:tcMar>
+          </w:tcPr>
+          <w:p>
+            <w:pPr>
+              <w:spacing w:before="0" w:after="40" w:line="240" w:lineRule="auto"/>
+            </w:pPr>
+            <w:r>
+              <w:rPr>
+                <w:b/>
+                <w:sz w:val="17"/>
+              </w:rPr>
+              <w:t>Controlled field</w:t>
+            </w:r>
+          </w:p>
+        </w:tc>
+        <w:tc>
+          <w:tcPr>
+            <w:tcW w:type="dxa" w:w="7260"/>
+            <w:shd w:fill="D9EAF7"/>
+            <w:vAlign w:val="center"/>
+            <w:tcMar>
+              <w:top w:w="90" w:type="dxa"/>
+              <w:left w:w="90" w:type="dxa"/>
+              <w:bottom w:w="90" w:type="dxa"/>
+              <w:right w:w="90" w:type="dxa"/>
+            </w:tcMar>
+          </w:tcPr>
+          <w:p>
+            <w:pPr>
+              <w:spacing w:before="0" w:after="40" w:line="240" w:lineRule="auto"/>
+            </w:pPr>
+            <w:r>
+              <w:rPr>
+                <w:b/>
+                <w:sz w:val="17"/>
+              </w:rPr>
+              <w:t>Authoritative value / rule</w:t>
+            </w:r>
+          </w:p>
+        </w:tc>
+      </w:tr>
+      <w:tr>
+        <w:tc>
+          <w:tcPr>
+            <w:tcW w:type="dxa" w:w="2100"/>
+            <w:vAlign w:val="center"/>
+            <w:tcMar>
+              <w:top w:w="90" w:type="dxa"/>
+              <w:left w:w="90" w:type="dxa"/>
+              <w:bottom w:w="90" w:type="dxa"/>
+              <w:right w:w="90" w:type="dxa"/>
+            </w:tcMar>
+          </w:tcPr>
+          <w:p>
+            <w:pPr>
+              <w:spacing w:before="0" w:after="40" w:line="240" w:lineRule="auto"/>
+            </w:pPr>
+            <w:r>
+              <w:rPr>
+                <w:sz w:val="17"/>
+              </w:rPr>
+              <w:t>Definition packages</w:t>
+            </w:r>
+          </w:p>
+        </w:tc>
+        <w:tc>
+          <w:tcPr>
+            <w:tcW w:type="dxa" w:w="7260"/>
+            <w:vAlign w:val="center"/>
+            <w:tcMar>
+              <w:top w:w="90" w:type="dxa"/>
+              <w:left w:w="90" w:type="dxa"/>
+              <w:bottom w:w="90" w:type="dxa"/>
+              <w:right w:w="90" w:type="dxa"/>
+            </w:tcMar>
+          </w:tcPr>
+          <w:p>
+            <w:pPr>
+              <w:spacing w:before="0" w:after="40" w:line="240" w:lineRule="auto"/>
+            </w:pPr>
+            <w:r>
+              <w:rPr>
+                <w:sz w:val="17"/>
+              </w:rPr>
+              <w:t>Future promoted Validation Catalogue package stores methods/criteria/case mappings and hashes; accepted v1.0/v1.1 catalogue packages remain byte-identical historical input.</w:t>
+            </w:r>
+          </w:p>
+        </w:tc>
+      </w:tr>
+      <w:tr>
+        <w:tc>
+          <w:tcPr>
+            <w:tcW w:type="dxa" w:w="2100"/>
+            <w:vAlign w:val="center"/>
+            <w:tcMar>
+              <w:top w:w="90" w:type="dxa"/>
+              <w:left w:w="90" w:type="dxa"/>
+              <w:bottom w:w="90" w:type="dxa"/>
+              <w:right w:w="90" w:type="dxa"/>
+            </w:tcMar>
+          </w:tcPr>
+          <w:p>
+            <w:pPr>
+              <w:spacing w:before="0" w:after="40" w:line="240" w:lineRule="auto"/>
+            </w:pPr>
+            <w:r>
+              <w:rPr>
+                <w:sz w:val="17"/>
+              </w:rPr>
+              <w:t>Context tables</w:t>
+            </w:r>
+          </w:p>
+        </w:tc>
+        <w:tc>
+          <w:tcPr>
+            <w:tcW w:type="dxa" w:w="7260"/>
+            <w:vAlign w:val="center"/>
+            <w:tcMar>
+              <w:top w:w="90" w:type="dxa"/>
+              <w:left w:w="90" w:type="dxa"/>
+              <w:bottom w:w="90" w:type="dxa"/>
+              <w:right w:w="90" w:type="dxa"/>
+            </w:tcMar>
+          </w:tcPr>
+          <w:p>
+            <w:pPr>
+              <w:spacing w:before="0" w:after="40" w:line="240" w:lineRule="auto"/>
+            </w:pPr>
+            <w:r>
+              <w:rPr>
+                <w:sz w:val="17"/>
+              </w:rPr>
+              <w:t>Separate typed headers/members for scenario, fixture, record-set and review contexts; exact membership freezes before final evaluation.</w:t>
+            </w:r>
+          </w:p>
+        </w:tc>
+      </w:tr>
+      <w:tr>
+        <w:tc>
+          <w:tcPr>
+            <w:tcW w:type="dxa" w:w="2100"/>
+            <w:vAlign w:val="center"/>
+            <w:tcMar>
+              <w:top w:w="90" w:type="dxa"/>
+              <w:left w:w="90" w:type="dxa"/>
+              <w:bottom w:w="90" w:type="dxa"/>
+              <w:right w:w="90" w:type="dxa"/>
+            </w:tcMar>
+          </w:tcPr>
+          <w:p>
+            <w:pPr>
+              <w:spacing w:before="0" w:after="40" w:line="240" w:lineRule="auto"/>
+            </w:pPr>
+            <w:r>
+              <w:rPr>
+                <w:sz w:val="17"/>
+              </w:rPr>
+              <w:t>Finding/review tables</w:t>
+            </w:r>
+          </w:p>
+        </w:tc>
+        <w:tc>
+          <w:tcPr>
+            <w:tcW w:type="dxa" w:w="7260"/>
+            <w:vAlign w:val="center"/>
+            <w:tcMar>
+              <w:top w:w="90" w:type="dxa"/>
+              <w:left w:w="90" w:type="dxa"/>
+              <w:bottom w:w="90" w:type="dxa"/>
+              <w:right w:w="90" w:type="dxa"/>
+            </w:tcMar>
+          </w:tcPr>
+          <w:p>
+            <w:pPr>
+              <w:spacing w:before="0" w:after="40" w:line="240" w:lineRule="auto"/>
+            </w:pPr>
+            <w:r>
+              <w:rPr>
+                <w:sz w:val="17"/>
+              </w:rPr>
+              <w:t>Machine finding plus source/evidence links; review proposal and independent finalisation actor/role/reason/evidence audit.</w:t>
+            </w:r>
+          </w:p>
+        </w:tc>
+      </w:tr>
+      <w:tr>
+        <w:tc>
+          <w:tcPr>
+            <w:tcW w:type="dxa" w:w="2100"/>
+            <w:vAlign w:val="center"/>
+            <w:tcMar>
+              <w:top w:w="90" w:type="dxa"/>
+              <w:left w:w="90" w:type="dxa"/>
+              <w:bottom w:w="90" w:type="dxa"/>
+              <w:right w:w="90" w:type="dxa"/>
+            </w:tcMar>
+          </w:tcPr>
+          <w:p>
+            <w:pPr>
+              <w:spacing w:before="0" w:after="40" w:line="240" w:lineRule="auto"/>
+            </w:pPr>
+            <w:r>
+              <w:rPr>
+                <w:sz w:val="17"/>
+              </w:rPr>
+              <w:t>Result/completeness</w:t>
+            </w:r>
+          </w:p>
+        </w:tc>
+        <w:tc>
+          <w:tcPr>
+            <w:tcW w:type="dxa" w:w="7260"/>
+            <w:vAlign w:val="center"/>
+            <w:tcMar>
+              <w:top w:w="90" w:type="dxa"/>
+              <w:left w:w="90" w:type="dxa"/>
+              <w:bottom w:w="90" w:type="dxa"/>
+              <w:right w:w="90" w:type="dxa"/>
+            </w:tcMar>
+          </w:tcPr>
+          <w:p>
+            <w:pPr>
+              <w:spacing w:before="0" w:after="40" w:line="240" w:lineRule="auto"/>
+            </w:pPr>
+            <w:r>
+              <w:rPr>
+                <w:sz w:val="17"/>
+              </w:rPr>
+              <w:t>Direct result and completeness diagnostics; existing composite/suspension records remain separate and linked by controlled source identities.</w:t>
+            </w:r>
+          </w:p>
+        </w:tc>
+      </w:tr>
+      <w:tr>
+        <w:tc>
+          <w:tcPr>
+            <w:tcW w:type="dxa" w:w="2100"/>
+            <w:vAlign w:val="center"/>
+            <w:tcMar>
+              <w:top w:w="90" w:type="dxa"/>
+              <w:left w:w="90" w:type="dxa"/>
+              <w:bottom w:w="90" w:type="dxa"/>
+              <w:right w:w="90" w:type="dxa"/>
+            </w:tcMar>
+          </w:tcPr>
+          <w:p>
+            <w:pPr>
+              <w:spacing w:before="0" w:after="40" w:line="240" w:lineRule="auto"/>
+            </w:pPr>
+            <w:r>
+              <w:rPr>
+                <w:sz w:val="17"/>
+              </w:rPr>
+              <w:t>Database guards</w:t>
+            </w:r>
+          </w:p>
+        </w:tc>
+        <w:tc>
+          <w:tcPr>
+            <w:tcW w:type="dxa" w:w="7260"/>
+            <w:vAlign w:val="center"/>
+            <w:tcMar>
+              <w:top w:w="90" w:type="dxa"/>
+              <w:left w:w="90" w:type="dxa"/>
+              <w:bottom w:w="90" w:type="dxa"/>
+              <w:right w:w="90" w:type="dxa"/>
+            </w:tcMar>
+          </w:tcPr>
+          <w:p>
+            <w:pPr>
+              <w:spacing w:before="0" w:after="40" w:line="240" w:lineRule="auto"/>
+            </w:pPr>
+            <w:r>
+              <w:rPr>
+                <w:sz w:val="17"/>
+              </w:rPr>
+              <w:t>Reject final record update/delete, criterion/context member substitution, late evidence insertion, reviewer-authority mutation, result override and parent-composite direct-result insertion.</w:t>
+            </w:r>
+          </w:p>
+        </w:tc>
+      </w:tr>
+    </w:tbl>
+    <w:p>
+      <w:pPr>
+        <w:pStyle w:val="Heading2"/>
+      </w:pPr>
+      <w:r>
+        <w:t>38.4 API, Actions and Read Models</w:t>
+      </w:r>
+    </w:p>
+    <w:tbl>
+      <w:tblPr>
+        <w:tblW w:type="dxa" w:w="9360"/>
+        <w:jc w:val="center"/>
+        <w:tblLayout w:type="fixed"/>
+        <w:tblLook w:firstColumn="1" w:firstRow="1" w:lastColumn="0" w:lastRow="0" w:noHBand="0" w:noVBand="1" w:val="04A0"/>
+        <w:tblInd w:type="dxa" w:w="120"/>
+        <w:tblBorders>
+          <w:top w:val="single" w:sz="6" w:color="B7B7B7"/>
+          <w:left w:val="single" w:sz="6" w:color="B7B7B7"/>
+          <w:bottom w:val="single" w:sz="6" w:color="B7B7B7"/>
+          <w:right w:val="single" w:sz="6" w:color="B7B7B7"/>
+          <w:insideH w:val="single" w:sz="6" w:color="B7B7B7"/>
+          <w:insideV w:val="single" w:sz="6" w:color="B7B7B7"/>
+        </w:tblBorders>
+      </w:tblPr>
+      <w:tblGrid>
+        <w:gridCol w:w="2100"/>
+        <w:gridCol w:w="7260"/>
+      </w:tblGrid>
+      <w:tr>
+        <w:trPr>
+          <w:tblHeader w:val="true"/>
+        </w:trPr>
+        <w:tc>
+          <w:tcPr>
+            <w:tcW w:type="dxa" w:w="2100"/>
+            <w:shd w:fill="D9EAF7"/>
+            <w:vAlign w:val="center"/>
+            <w:tcMar>
+              <w:top w:w="90" w:type="dxa"/>
+              <w:left w:w="90" w:type="dxa"/>
+              <w:bottom w:w="90" w:type="dxa"/>
+              <w:right w:w="90" w:type="dxa"/>
+            </w:tcMar>
+          </w:tcPr>
+          <w:p>
+            <w:pPr>
+              <w:spacing w:before="0" w:after="40" w:line="240" w:lineRule="auto"/>
+            </w:pPr>
+            <w:r>
+              <w:rPr>
+                <w:b/>
+                <w:sz w:val="17"/>
+              </w:rPr>
+              <w:t>Controlled field</w:t>
+            </w:r>
+          </w:p>
+        </w:tc>
+        <w:tc>
+          <w:tcPr>
+            <w:tcW w:type="dxa" w:w="7260"/>
+            <w:shd w:fill="D9EAF7"/>
+            <w:vAlign w:val="center"/>
+            <w:tcMar>
+              <w:top w:w="90" w:type="dxa"/>
+              <w:left w:w="90" w:type="dxa"/>
+              <w:bottom w:w="90" w:type="dxa"/>
+              <w:right w:w="90" w:type="dxa"/>
+            </w:tcMar>
+          </w:tcPr>
+          <w:p>
+            <w:pPr>
+              <w:spacing w:before="0" w:after="40" w:line="240" w:lineRule="auto"/>
+            </w:pPr>
+            <w:r>
+              <w:rPr>
+                <w:b/>
+                <w:sz w:val="17"/>
+              </w:rPr>
+              <w:t>Authoritative value / rule</w:t>
+            </w:r>
+          </w:p>
+        </w:tc>
+      </w:tr>
+      <w:tr>
+        <w:tc>
+          <w:tcPr>
+            <w:tcW w:type="dxa" w:w="2100"/>
+            <w:vAlign w:val="center"/>
+            <w:tcMar>
+              <w:top w:w="90" w:type="dxa"/>
+              <w:left w:w="90" w:type="dxa"/>
+              <w:bottom w:w="90" w:type="dxa"/>
+              <w:right w:w="90" w:type="dxa"/>
+            </w:tcMar>
+          </w:tcPr>
+          <w:p>
+            <w:pPr>
+              <w:spacing w:before="0" w:after="40" w:line="240" w:lineRule="auto"/>
+            </w:pPr>
+            <w:r>
+              <w:rPr>
+                <w:sz w:val="17"/>
+              </w:rPr>
+              <w:t>Prepare determination</w:t>
+            </w:r>
+          </w:p>
+        </w:tc>
+        <w:tc>
+          <w:tcPr>
+            <w:tcW w:type="dxa" w:w="7260"/>
+            <w:vAlign w:val="center"/>
+            <w:tcMar>
+              <w:top w:w="90" w:type="dxa"/>
+              <w:left w:w="90" w:type="dxa"/>
+              <w:bottom w:w="90" w:type="dxa"/>
+              <w:right w:w="90" w:type="dxa"/>
+            </w:tcMar>
+          </w:tcPr>
+          <w:p>
+            <w:pPr>
+              <w:spacing w:before="0" w:after="40" w:line="240" w:lineRule="auto"/>
+            </w:pPr>
+            <w:r>
+              <w:rPr>
+                <w:sz w:val="17"/>
+              </w:rPr>
+              <w:t>Resolve active target/method and return backend-owned required context/criterion/evidence roles; client cannot alter definition meaning.</w:t>
+            </w:r>
+          </w:p>
+        </w:tc>
+      </w:tr>
+      <w:tr>
+        <w:tc>
+          <w:tcPr>
+            <w:tcW w:type="dxa" w:w="2100"/>
+            <w:vAlign w:val="center"/>
+            <w:tcMar>
+              <w:top w:w="90" w:type="dxa"/>
+              <w:left w:w="90" w:type="dxa"/>
+              <w:bottom w:w="90" w:type="dxa"/>
+              <w:right w:w="90" w:type="dxa"/>
+            </w:tcMar>
+          </w:tcPr>
+          <w:p>
+            <w:pPr>
+              <w:spacing w:before="0" w:after="40" w:line="240" w:lineRule="auto"/>
+            </w:pPr>
+            <w:r>
+              <w:rPr>
+                <w:sz w:val="17"/>
+              </w:rPr>
+              <w:t>Bind/capture context</w:t>
+            </w:r>
+          </w:p>
+        </w:tc>
+        <w:tc>
+          <w:tcPr>
+            <w:tcW w:type="dxa" w:w="7260"/>
+            <w:vAlign w:val="center"/>
+            <w:tcMar>
+              <w:top w:w="90" w:type="dxa"/>
+              <w:left w:w="90" w:type="dxa"/>
+              <w:bottom w:w="90" w:type="dxa"/>
+              <w:right w:w="90" w:type="dxa"/>
+            </w:tcMar>
+          </w:tcPr>
+          <w:p>
+            <w:pPr>
+              <w:spacing w:before="0" w:after="40" w:line="240" w:lineRule="auto"/>
+            </w:pPr>
+            <w:r>
+              <w:rPr>
+                <w:sz w:val="17"/>
+              </w:rPr>
+              <w:t>Create/bind only the definition-authorised context kind and exact role members; scenario binding accepts one existing/created run only.</w:t>
+            </w:r>
+          </w:p>
+        </w:tc>
+      </w:tr>
+      <w:tr>
+        <w:tc>
+          <w:tcPr>
+            <w:tcW w:type="dxa" w:w="2100"/>
+            <w:vAlign w:val="center"/>
+            <w:tcMar>
+              <w:top w:w="90" w:type="dxa"/>
+              <w:left w:w="90" w:type="dxa"/>
+              <w:bottom w:w="90" w:type="dxa"/>
+              <w:right w:w="90" w:type="dxa"/>
+            </w:tcMar>
+          </w:tcPr>
+          <w:p>
+            <w:pPr>
+              <w:spacing w:before="0" w:after="40" w:line="240" w:lineRule="auto"/>
+            </w:pPr>
+            <w:r>
+              <w:rPr>
+                <w:sz w:val="17"/>
+              </w:rPr>
+              <w:t>Evaluate machine criteria</w:t>
+            </w:r>
+          </w:p>
+        </w:tc>
+        <w:tc>
+          <w:tcPr>
+            <w:tcW w:type="dxa" w:w="7260"/>
+            <w:vAlign w:val="center"/>
+            <w:tcMar>
+              <w:top w:w="90" w:type="dxa"/>
+              <w:left w:w="90" w:type="dxa"/>
+              <w:bottom w:w="90" w:type="dxa"/>
+              <w:right w:w="90" w:type="dxa"/>
+            </w:tcMar>
+          </w:tcPr>
+          <w:p>
+            <w:pPr>
+              <w:spacing w:before="0" w:after="40" w:line="240" w:lineRule="auto"/>
+            </w:pPr>
+            <w:r>
+              <w:rPr>
+                <w:sz w:val="17"/>
+              </w:rPr>
+              <w:t>Backend resolves adapters/operators and returns immutable findings plus incomplete reasons. No caller-supplied observed result.</w:t>
+            </w:r>
+          </w:p>
+        </w:tc>
+      </w:tr>
+      <w:tr>
+        <w:tc>
+          <w:tcPr>
+            <w:tcW w:type="dxa" w:w="2100"/>
+            <w:vAlign w:val="center"/>
+            <w:tcMar>
+              <w:top w:w="90" w:type="dxa"/>
+              <w:left w:w="90" w:type="dxa"/>
+              <w:bottom w:w="90" w:type="dxa"/>
+              <w:right w:w="90" w:type="dxa"/>
+            </w:tcMar>
+          </w:tcPr>
+          <w:p>
+            <w:pPr>
+              <w:spacing w:before="0" w:after="40" w:line="240" w:lineRule="auto"/>
+            </w:pPr>
+            <w:r>
+              <w:rPr>
+                <w:sz w:val="17"/>
+              </w:rPr>
+              <w:t>Propose/finalise reviewer finding</w:t>
+            </w:r>
+          </w:p>
+        </w:tc>
+        <w:tc>
+          <w:tcPr>
+            <w:tcW w:type="dxa" w:w="7260"/>
+            <w:vAlign w:val="center"/>
+            <w:tcMar>
+              <w:top w:w="90" w:type="dxa"/>
+              <w:left w:w="90" w:type="dxa"/>
+              <w:bottom w:w="90" w:type="dxa"/>
+              <w:right w:w="90" w:type="dxa"/>
+            </w:tcMar>
+          </w:tcPr>
+          <w:p>
+            <w:pPr>
+              <w:spacing w:before="0" w:after="40" w:line="240" w:lineRule="auto"/>
+            </w:pPr>
+            <w:r>
+              <w:rPr>
+                <w:sz w:val="17"/>
+              </w:rPr>
+              <w:t>Accept only exact criterion ID, controlled evidence references, actor ID and criterion-level finding/reason under eligibility/distinct-actor checks.</w:t>
+            </w:r>
+          </w:p>
+        </w:tc>
+      </w:tr>
+      <w:tr>
+        <w:tc>
+          <w:tcPr>
+            <w:tcW w:type="dxa" w:w="2100"/>
+            <w:vAlign w:val="center"/>
+            <w:tcMar>
+              <w:top w:w="90" w:type="dxa"/>
+              <w:left w:w="90" w:type="dxa"/>
+              <w:bottom w:w="90" w:type="dxa"/>
+              <w:right w:w="90" w:type="dxa"/>
+            </w:tcMar>
+          </w:tcPr>
+          <w:p>
+            <w:pPr>
+              <w:spacing w:before="0" w:after="40" w:line="240" w:lineRule="auto"/>
+            </w:pPr>
+            <w:r>
+              <w:rPr>
+                <w:sz w:val="17"/>
+              </w:rPr>
+              <w:t>Finalise direct result</w:t>
+            </w:r>
+          </w:p>
+        </w:tc>
+        <w:tc>
+          <w:tcPr>
+            <w:tcW w:type="dxa" w:w="7260"/>
+            <w:vAlign w:val="center"/>
+            <w:tcMar>
+              <w:top w:w="90" w:type="dxa"/>
+              <w:left w:w="90" w:type="dxa"/>
+              <w:bottom w:w="90" w:type="dxa"/>
+              <w:right w:w="90" w:type="dxa"/>
+            </w:tcMar>
+          </w:tcPr>
+          <w:p>
+            <w:pPr>
+              <w:spacing w:before="0" w:after="40" w:line="240" w:lineRule="auto"/>
+            </w:pPr>
+            <w:r>
+              <w:rPr>
+                <w:sz w:val="17"/>
+              </w:rPr>
+              <w:t>Backend action available only when exact completeness passes; response returns PASS/FAIL derived from findings. No verdict parameter.</w:t>
+            </w:r>
+          </w:p>
+        </w:tc>
+      </w:tr>
+      <w:tr>
+        <w:tc>
+          <w:tcPr>
+            <w:tcW w:type="dxa" w:w="2100"/>
+            <w:vAlign w:val="center"/>
+            <w:tcMar>
+              <w:top w:w="90" w:type="dxa"/>
+              <w:left w:w="90" w:type="dxa"/>
+              <w:bottom w:w="90" w:type="dxa"/>
+              <w:right w:w="90" w:type="dxa"/>
+            </w:tcMar>
+          </w:tcPr>
+          <w:p>
+            <w:pPr>
+              <w:spacing w:before="0" w:after="40" w:line="240" w:lineRule="auto"/>
+            </w:pPr>
+            <w:r>
+              <w:rPr>
+                <w:sz w:val="17"/>
+              </w:rPr>
+              <w:t>Assemble/finalise composite</w:t>
+            </w:r>
+          </w:p>
+        </w:tc>
+        <w:tc>
+          <w:tcPr>
+            <w:tcW w:type="dxa" w:w="7260"/>
+            <w:vAlign w:val="center"/>
+            <w:tcMar>
+              <w:top w:w="90" w:type="dxa"/>
+              <w:left w:w="90" w:type="dxa"/>
+              <w:bottom w:w="90" w:type="dxa"/>
+              <w:right w:w="90" w:type="dxa"/>
+            </w:tcMar>
+          </w:tcPr>
+          <w:p>
+            <w:pPr>
+              <w:spacing w:before="0" w:after="40" w:line="240" w:lineRule="auto"/>
+            </w:pPr>
+            <w:r>
+              <w:rPr>
+                <w:sz w:val="17"/>
+              </w:rPr>
+              <w:t>Existing DC-004 actions use exact case sources only. UI exposes source kind and never offers a direct parent DC-006 result action.</w:t>
+            </w:r>
+          </w:p>
+        </w:tc>
+      </w:tr>
+      <w:tr>
+        <w:tc>
+          <w:tcPr>
+            <w:tcW w:type="dxa" w:w="2100"/>
+            <w:vAlign w:val="center"/>
+            <w:tcMar>
+              <w:top w:w="90" w:type="dxa"/>
+              <w:left w:w="90" w:type="dxa"/>
+              <w:bottom w:w="90" w:type="dxa"/>
+              <w:right w:w="90" w:type="dxa"/>
+            </w:tcMar>
+          </w:tcPr>
+          <w:p>
+            <w:pPr>
+              <w:spacing w:before="0" w:after="40" w:line="240" w:lineRule="auto"/>
+            </w:pPr>
+            <w:r>
+              <w:rPr>
+                <w:sz w:val="17"/>
+              </w:rPr>
+              <w:t>Suspend</w:t>
+            </w:r>
+          </w:p>
+        </w:tc>
+        <w:tc>
+          <w:tcPr>
+            <w:tcW w:type="dxa" w:w="7260"/>
+            <w:vAlign w:val="center"/>
+            <w:tcMar>
+              <w:top w:w="90" w:type="dxa"/>
+              <w:left w:w="90" w:type="dxa"/>
+              <w:bottom w:w="90" w:type="dxa"/>
+              <w:right w:w="90" w:type="dxa"/>
+            </w:tcMar>
+          </w:tcPr>
+          <w:p>
+            <w:pPr>
+              <w:spacing w:before="0" w:after="40" w:line="240" w:lineRule="auto"/>
+            </w:pPr>
+            <w:r>
+              <w:rPr>
+                <w:sz w:val="17"/>
+              </w:rPr>
+              <w:t>Existing DC-005 API only; no BLOCKED-TEST selector and no automatic conversion from incomplete.</w:t>
+            </w:r>
+          </w:p>
+        </w:tc>
+      </w:tr>
+    </w:tbl>
+    <w:p>
+      <w:pPr>
+        <w:pStyle w:val="Heading2"/>
+      </w:pPr>
+      <w:r>
+        <w:t>38.5 Review Presentation</w:t>
+      </w:r>
+    </w:p>
+    <w:p>
+      <w:r>
+        <w:t>Validation/Evidence presents method/context identity, expected roles, completeness, each criterion's kind/expectation/source/operator/finding/requirement_ids/evidence, reviewer authority status and backend aggregate. Defined coverage and successfully verified evidence are shown separately. A composite shows the exact required cases, each constituent finding chain or valid suspension source, static parent coverage union and achieved aggregate evidence without implying that a suspended case verified its mapped requirements.</w:t>
+      </w:r>
+    </w:p>
+    <w:p>
+      <w:r>
+        <w:t>NFR review surfaces machine-proven presence/identity/linkage/structure/configuration separately from reviewer propositions for prominence, understandability, clarity, engineering-first character and not-misleading treatment. Reviewer controls never expose an overall verdict selector.</w:t>
+      </w:r>
+    </w:p>
+    <w:p>
+      <w:pPr>
+        <w:pStyle w:val="Heading2"/>
+      </w:pPr>
+      <w:r>
+        <w:t>38.6 History, Resolution and Export</w:t>
+      </w:r>
+    </w:p>
+    <w:p>
+      <w:r>
+        <w:t>Read models and export resolve completed records against their stored Validation Catalogue/test/case/method/criterion identities and retain separate Network Configuration v1.0/v1.1 identity. A future promoted catalogue does not relabel historical executions. Unfinished old-catalogue work becomes read-only. Export remains append-only/non-overwriting and retains file/entry/archive hashes, relative links, source versus generation build and full requirement→criterion→finding→evidence links.</w:t>
+      </w:r>
+    </w:p>
+    <w:p>
+      <w:pPr>
+        <w:pStyle w:val="Heading2"/>
+      </w:pPr>
+      <w:r>
+        <w:t>38.7 Future Machine-Application Boundary</w:t>
+      </w:r>
+    </w:p>
+    <w:tbl>
+      <w:tblPr>
+        <w:tblW w:type="dxa" w:w="9360"/>
+        <w:jc w:val="center"/>
+        <w:tblLayout w:type="fixed"/>
+        <w:tblLook w:firstColumn="1" w:firstRow="1" w:lastColumn="0" w:lastRow="0" w:noHBand="0" w:noVBand="1" w:val="04A0"/>
+        <w:tblInd w:type="dxa" w:w="120"/>
+        <w:tblBorders>
+          <w:top w:val="single" w:sz="6" w:color="B7B7B7"/>
+          <w:left w:val="single" w:sz="6" w:color="B7B7B7"/>
+          <w:bottom w:val="single" w:sz="6" w:color="B7B7B7"/>
+          <w:right w:val="single" w:sz="6" w:color="B7B7B7"/>
+          <w:insideH w:val="single" w:sz="6" w:color="B7B7B7"/>
+          <w:insideV w:val="single" w:sz="6" w:color="B7B7B7"/>
+        </w:tblBorders>
+      </w:tblPr>
+      <w:tblGrid>
+        <w:gridCol w:w="2100"/>
+        <w:gridCol w:w="7260"/>
+      </w:tblGrid>
+      <w:tr>
+        <w:trPr>
+          <w:tblHeader w:val="true"/>
+        </w:trPr>
+        <w:tc>
+          <w:tcPr>
+            <w:tcW w:type="dxa" w:w="2100"/>
+            <w:shd w:fill="D9EAF7"/>
+            <w:vAlign w:val="center"/>
+            <w:tcMar>
+              <w:top w:w="90" w:type="dxa"/>
+              <w:left w:w="90" w:type="dxa"/>
+              <w:bottom w:w="90" w:type="dxa"/>
+              <w:right w:w="90" w:type="dxa"/>
+            </w:tcMar>
+          </w:tcPr>
+          <w:p>
+            <w:pPr>
+              <w:spacing w:before="0" w:after="40" w:line="240" w:lineRule="auto"/>
+            </w:pPr>
+            <w:r>
+              <w:rPr>
+                <w:b/>
+                <w:sz w:val="17"/>
+              </w:rPr>
+              <w:t>Controlled field</w:t>
+            </w:r>
+          </w:p>
+        </w:tc>
+        <w:tc>
+          <w:tcPr>
+            <w:tcW w:type="dxa" w:w="7260"/>
+            <w:shd w:fill="D9EAF7"/>
+            <w:vAlign w:val="center"/>
+            <w:tcMar>
+              <w:top w:w="90" w:type="dxa"/>
+              <w:left w:w="90" w:type="dxa"/>
+              <w:bottom w:w="90" w:type="dxa"/>
+              <w:right w:w="90" w:type="dxa"/>
+            </w:tcMar>
+          </w:tcPr>
+          <w:p>
+            <w:pPr>
+              <w:spacing w:before="0" w:after="40" w:line="240" w:lineRule="auto"/>
+            </w:pPr>
+            <w:r>
+              <w:rPr>
+                <w:b/>
+                <w:sz w:val="17"/>
+              </w:rPr>
+              <w:t>Authoritative value / rule</w:t>
+            </w:r>
+          </w:p>
+        </w:tc>
+      </w:tr>
+      <w:tr>
+        <w:tc>
+          <w:tcPr>
+            <w:tcW w:type="dxa" w:w="2100"/>
+            <w:vAlign w:val="center"/>
+            <w:tcMar>
+              <w:top w:w="90" w:type="dxa"/>
+              <w:left w:w="90" w:type="dxa"/>
+              <w:bottom w:w="90" w:type="dxa"/>
+              <w:right w:w="90" w:type="dxa"/>
+            </w:tcMar>
+          </w:tcPr>
+          <w:p>
+            <w:pPr>
+              <w:spacing w:before="0" w:after="40" w:line="240" w:lineRule="auto"/>
+            </w:pPr>
+            <w:r>
+              <w:rPr>
+                <w:sz w:val="17"/>
+              </w:rPr>
+              <w:t>Permitted only after separate authorisation</w:t>
+            </w:r>
+          </w:p>
+        </w:tc>
+        <w:tc>
+          <w:tcPr>
+            <w:tcW w:type="dxa" w:w="7260"/>
+            <w:vAlign w:val="center"/>
+            <w:tcMar>
+              <w:top w:w="90" w:type="dxa"/>
+              <w:left w:w="90" w:type="dxa"/>
+              <w:bottom w:w="90" w:type="dxa"/>
+              <w:right w:w="90" w:type="dxa"/>
+            </w:tcMar>
+          </w:tcPr>
+          <w:p>
+            <w:pPr>
+              <w:spacing w:before="0" w:after="40" w:line="240" w:lineRule="auto"/>
+            </w:pPr>
+            <w:r>
+              <w:rPr>
+                <w:sz w:val="17"/>
+              </w:rPr>
+              <w:t>Preserve historical Validation Catalogue packages; promote the accepted criteria catalogue; add contracts/resolver/adapters/operators/context/finding/review/result persistence; extend API/read models/export; implement exact audit/tests.</w:t>
+            </w:r>
+          </w:p>
+        </w:tc>
+      </w:tr>
+      <w:tr>
+        <w:tc>
+          <w:tcPr>
+            <w:tcW w:type="dxa" w:w="2100"/>
+            <w:vAlign w:val="center"/>
+            <w:tcMar>
+              <w:top w:w="90" w:type="dxa"/>
+              <w:left w:w="90" w:type="dxa"/>
+              <w:bottom w:w="90" w:type="dxa"/>
+              <w:right w:w="90" w:type="dxa"/>
+            </w:tcMar>
+          </w:tcPr>
+          <w:p>
+            <w:pPr>
+              <w:spacing w:before="0" w:after="40" w:line="240" w:lineRule="auto"/>
+            </w:pPr>
+            <w:r>
+              <w:rPr>
+                <w:sz w:val="17"/>
+              </w:rPr>
+              <w:t>Explicitly prohibited</w:t>
+            </w:r>
+          </w:p>
+        </w:tc>
+        <w:tc>
+          <w:tcPr>
+            <w:tcW w:type="dxa" w:w="7260"/>
+            <w:vAlign w:val="center"/>
+            <w:tcMar>
+              <w:top w:w="90" w:type="dxa"/>
+              <w:left w:w="90" w:type="dxa"/>
+              <w:bottom w:w="90" w:type="dxa"/>
+              <w:right w:w="90" w:type="dxa"/>
+            </w:tcMar>
+          </w:tcPr>
+          <w:p>
+            <w:pPr>
+              <w:spacing w:before="0" w:after="40" w:line="240" w:lineRule="auto"/>
+            </w:pPr>
+            <w:r>
+              <w:rPr>
+                <w:sz w:val="17"/>
+              </w:rPr>
+              <w:t>Network/topology/outage/restoration/telemetry behaviour change; direct composite-parent method/result; test-ID outcome lookup; reviewer overall verdict; fictional run; manufactured Exploration suspension; machine subjective judgement; RTM/event/network/dependency change; I9 resumption.</w:t>
+            </w:r>
+          </w:p>
+        </w:tc>
+      </w:tr>
+    </w:tbl>
+    <w:p>
+      <w:pPr>
+        <w:pStyle w:val="Heading2"/>
+      </w:pPr>
+      <w:r>
+        <w:t>38.8 Proposed Application and Review Gate</w:t>
+      </w:r>
+    </w:p>
+    <w:p>
+      <w:r>
+        <w:t>Future verification shall prove all direct and exact constituent coverage unions, generic selector/operator behaviour, one-run scenario bindings, N0–N5 chronology, reviewer boundary, exact event registry, Exploration separation, deterministic/package roles, historical resolution, persistence immutability, DC-004/DC-005 compatibility and unchanged 24/124/286/15 invariants.</w:t>
+      </w:r>
+    </w:p>
+    <w:p>
+      <w:r>
+        <w:t>DC-006 design decision is independently accepted. This Section 38 and proposed Demonstrator Design v0.5 are an authoritative-document application pending independent review. No machine Validation Catalogue, schema, migration, application, dependency or I9 authority is granted.</w:t>
+      </w:r>
+    </w:p>
+    <w:p>
+      <w:r>
+        <w:t>V2 Automation Candidate — Evidence-to-criterion binding, coverage diagnostics and review-package preparation are strong future automation candidates. V1 remains definition-driven, immutable and reviewer-controlled.</w:t>
       </w:r>
     </w:p>
     <w:sectPr>

</xml_diff>

<commit_message>
docs: correct DC-006 application findings
</commit_message>
<xml_diff>
--- a/01-engineering-source-documents/OT Project Demonstrator Design.docx
+++ b/01-engineering-source-documents/OT Project Demonstrator Design.docx
@@ -25223,7 +25223,7 @@
     </w:tbl>
     <w:p>
       <w:r>
-        <w:t>The adapter registry is typed and versioned. Selectors address actual preserved backend records; operators are generic. No production branch may return an observed value or verdict by test_id, case_id, section ID, Network Configuration version or expected-outcome lookup.</w:t>
+        <w:t>The adapter registry is typed and versioned. Selectors address actual preserved backend records; every criterion uses exactly one accepted primitive operator and a separate definition-owned normalisation profile. Compound assertions are split or use a deterministic derived selector; no new parameterised/compound operator is permitted. No production branch may return an observed value or verdict by test_id, case_id, section ID, Network Configuration version or expected-outcome lookup.</w:t>
       </w:r>
     </w:p>
     <w:p>
@@ -25986,6 +25986,997 @@
     <w:p>
       <w:r>
         <w:t>NFR review surfaces machine-proven presence/identity/linkage/structure/configuration separately from reviewer propositions for prominence, understandability, clarity, engineering-first character and not-misleading treatment. Reviewer controls never expose an overall verdict selector.</w:t>
+      </w:r>
+    </w:p>
+    <w:p>
+      <w:pPr>
+        <w:pStyle w:val="Heading3"/>
+      </w:pPr>
+      <w:r>
+        <w:t>38.5.1 Exact NFR Review Evidence Sets</w:t>
+      </w:r>
+    </w:p>
+    <w:p>
+      <w:r>
+        <w:t>CONTROLLED_SURFACE_SET is the exact eight-member Demonstrator Design Section 14 view register below. Every member must visibly carry the fixed notice 'Simulated operation only — no real equipment control' and the exact identity profile shown. The implementation cannot add, omit or substitute a review member when executing VT-NFR-REVIEW-001.</w:t>
+      </w:r>
+    </w:p>
+    <w:tbl>
+      <w:tblPr>
+        <w:tblW w:type="dxa" w:w="9360"/>
+        <w:jc w:val="center"/>
+        <w:tblLayout w:type="fixed"/>
+        <w:tblLook w:firstColumn="1" w:firstRow="1" w:lastColumn="0" w:lastRow="0" w:noHBand="0" w:noVBand="1" w:val="04A0"/>
+        <w:tblInd w:type="dxa" w:w="120"/>
+        <w:tblBorders>
+          <w:top w:val="single" w:sz="6" w:color="B7B7B7"/>
+          <w:left w:val="single" w:sz="6" w:color="B7B7B7"/>
+          <w:bottom w:val="single" w:sz="6" w:color="B7B7B7"/>
+          <w:right w:val="single" w:sz="6" w:color="B7B7B7"/>
+          <w:insideH w:val="single" w:sz="6" w:color="B7B7B7"/>
+          <w:insideV w:val="single" w:sz="6" w:color="B7B7B7"/>
+        </w:tblBorders>
+      </w:tblPr>
+      <w:tblGrid>
+        <w:gridCol w:w="2100"/>
+        <w:gridCol w:w="7260"/>
+      </w:tblGrid>
+      <w:tr>
+        <w:trPr>
+          <w:tblHeader w:val="true"/>
+        </w:trPr>
+        <w:tc>
+          <w:tcPr>
+            <w:tcW w:type="dxa" w:w="2100"/>
+            <w:shd w:fill="D9EAF7"/>
+            <w:vAlign w:val="center"/>
+            <w:tcMar>
+              <w:top w:w="90" w:type="dxa"/>
+              <w:left w:w="90" w:type="dxa"/>
+              <w:bottom w:w="90" w:type="dxa"/>
+              <w:right w:w="90" w:type="dxa"/>
+            </w:tcMar>
+          </w:tcPr>
+          <w:p>
+            <w:pPr>
+              <w:spacing w:before="0" w:after="40" w:line="240" w:lineRule="auto"/>
+            </w:pPr>
+            <w:r>
+              <w:rPr>
+                <w:b/>
+                <w:sz w:val="17"/>
+              </w:rPr>
+              <w:t>Controlled field</w:t>
+            </w:r>
+          </w:p>
+        </w:tc>
+        <w:tc>
+          <w:tcPr>
+            <w:tcW w:type="dxa" w:w="7260"/>
+            <w:shd w:fill="D9EAF7"/>
+            <w:vAlign w:val="center"/>
+            <w:tcMar>
+              <w:top w:w="90" w:type="dxa"/>
+              <w:left w:w="90" w:type="dxa"/>
+              <w:bottom w:w="90" w:type="dxa"/>
+              <w:right w:w="90" w:type="dxa"/>
+            </w:tcMar>
+          </w:tcPr>
+          <w:p>
+            <w:pPr>
+              <w:spacing w:before="0" w:after="40" w:line="240" w:lineRule="auto"/>
+            </w:pPr>
+            <w:r>
+              <w:rPr>
+                <w:b/>
+                <w:sz w:val="17"/>
+              </w:rPr>
+              <w:t>Authoritative value / rule</w:t>
+            </w:r>
+          </w:p>
+        </w:tc>
+      </w:tr>
+      <w:tr>
+        <w:tc>
+          <w:tcPr>
+            <w:tcW w:type="dxa" w:w="2100"/>
+            <w:vAlign w:val="center"/>
+            <w:tcMar>
+              <w:top w:w="90" w:type="dxa"/>
+              <w:left w:w="90" w:type="dxa"/>
+              <w:bottom w:w="90" w:type="dxa"/>
+              <w:right w:w="90" w:type="dxa"/>
+            </w:tcMar>
+          </w:tcPr>
+          <w:p>
+            <w:pPr>
+              <w:spacing w:before="0" w:after="40" w:line="240" w:lineRule="auto"/>
+            </w:pPr>
+            <w:r>
+              <w:rPr>
+                <w:sz w:val="17"/>
+              </w:rPr>
+              <w:t>Start / Run Setup</w:t>
+            </w:r>
+          </w:p>
+        </w:tc>
+        <w:tc>
+          <w:tcPr>
+            <w:tcW w:type="dxa" w:w="7260"/>
+            <w:vAlign w:val="center"/>
+            <w:tcMar>
+              <w:top w:w="90" w:type="dxa"/>
+              <w:left w:w="90" w:type="dxa"/>
+              <w:bottom w:w="90" w:type="dxa"/>
+              <w:right w:w="90" w:type="dxa"/>
+            </w:tcMar>
+          </w:tcPr>
+          <w:p>
+            <w:pPr>
+              <w:spacing w:before="0" w:after="40" w:line="240" w:lineRule="auto"/>
+            </w:pPr>
+            <w:r>
+              <w:rPr>
+                <w:sz w:val="17"/>
+              </w:rPr>
+              <w:t>Fixed notice; mode; test and Validation Catalogue identity; Network Configuration identity; Exploration fault selection where applicable; backend build identity; initial-condition preview; full run identity after creation.</w:t>
+            </w:r>
+          </w:p>
+        </w:tc>
+      </w:tr>
+      <w:tr>
+        <w:tc>
+          <w:tcPr>
+            <w:tcW w:type="dxa" w:w="2100"/>
+            <w:vAlign w:val="center"/>
+            <w:tcMar>
+              <w:top w:w="90" w:type="dxa"/>
+              <w:left w:w="90" w:type="dxa"/>
+              <w:bottom w:w="90" w:type="dxa"/>
+              <w:right w:w="90" w:type="dxa"/>
+            </w:tcMar>
+          </w:tcPr>
+          <w:p>
+            <w:pPr>
+              <w:spacing w:before="0" w:after="40" w:line="240" w:lineRule="auto"/>
+            </w:pPr>
+            <w:r>
+              <w:rPr>
+                <w:sz w:val="17"/>
+              </w:rPr>
+              <w:t>Operational Workspace</w:t>
+            </w:r>
+          </w:p>
+        </w:tc>
+        <w:tc>
+          <w:tcPr>
+            <w:tcW w:type="dxa" w:w="7260"/>
+            <w:vAlign w:val="center"/>
+            <w:tcMar>
+              <w:top w:w="90" w:type="dxa"/>
+              <w:left w:w="90" w:type="dxa"/>
+              <w:bottom w:w="90" w:type="dxa"/>
+              <w:right w:w="90" w:type="dxa"/>
+            </w:tcMar>
+          </w:tcPr>
+          <w:p>
+            <w:pPr>
+              <w:spacing w:before="0" w:after="40" w:line="240" w:lineRule="auto"/>
+            </w:pPr>
+            <w:r>
+              <w:rPr>
+                <w:sz w:val="17"/>
+              </w:rPr>
+              <w:t>Fixed notice; full run identity; mode; Network Configuration identity; selected/controlled fault; workflow/N-state; state revision; evidence class; backend build identity.</w:t>
+            </w:r>
+          </w:p>
+        </w:tc>
+      </w:tr>
+      <w:tr>
+        <w:tc>
+          <w:tcPr>
+            <w:tcW w:type="dxa" w:w="2100"/>
+            <w:vAlign w:val="center"/>
+            <w:tcMar>
+              <w:top w:w="90" w:type="dxa"/>
+              <w:left w:w="90" w:type="dxa"/>
+              <w:bottom w:w="90" w:type="dxa"/>
+              <w:right w:w="90" w:type="dxa"/>
+            </w:tcMar>
+          </w:tcPr>
+          <w:p>
+            <w:pPr>
+              <w:spacing w:before="0" w:after="40" w:line="240" w:lineRule="auto"/>
+            </w:pPr>
+            <w:r>
+              <w:rPr>
+                <w:sz w:val="17"/>
+              </w:rPr>
+              <w:t>Telemetry &amp; Events</w:t>
+            </w:r>
+          </w:p>
+        </w:tc>
+        <w:tc>
+          <w:tcPr>
+            <w:tcW w:type="dxa" w:w="7260"/>
+            <w:vAlign w:val="center"/>
+            <w:tcMar>
+              <w:top w:w="90" w:type="dxa"/>
+              <w:left w:w="90" w:type="dxa"/>
+              <w:bottom w:w="90" w:type="dxa"/>
+              <w:right w:w="90" w:type="dxa"/>
+            </w:tcMar>
+          </w:tcPr>
+          <w:p>
+            <w:pPr>
+              <w:spacing w:before="0" w:after="40" w:line="240" w:lineRule="auto"/>
+            </w:pPr>
+            <w:r>
+              <w:rPr>
+                <w:sz w:val="17"/>
+              </w:rPr>
+              <w:t>Fixed notice; full run identity; telemetry value/quality/timestamp/age/freshness/reasons; exact event type/sequence/time/revision/source identity.</w:t>
+            </w:r>
+          </w:p>
+        </w:tc>
+      </w:tr>
+      <w:tr>
+        <w:tc>
+          <w:tcPr>
+            <w:tcW w:type="dxa" w:w="2100"/>
+            <w:vAlign w:val="center"/>
+            <w:tcMar>
+              <w:top w:w="90" w:type="dxa"/>
+              <w:left w:w="90" w:type="dxa"/>
+              <w:bottom w:w="90" w:type="dxa"/>
+              <w:right w:w="90" w:type="dxa"/>
+            </w:tcMar>
+          </w:tcPr>
+          <w:p>
+            <w:pPr>
+              <w:spacing w:before="0" w:after="40" w:line="240" w:lineRule="auto"/>
+            </w:pPr>
+            <w:r>
+              <w:rPr>
+                <w:sz w:val="17"/>
+              </w:rPr>
+              <w:t>Restoration Assessment</w:t>
+            </w:r>
+          </w:p>
+        </w:tc>
+        <w:tc>
+          <w:tcPr>
+            <w:tcW w:type="dxa" w:w="7260"/>
+            <w:vAlign w:val="center"/>
+            <w:tcMar>
+              <w:top w:w="90" w:type="dxa"/>
+              <w:left w:w="90" w:type="dxa"/>
+              <w:bottom w:w="90" w:type="dxa"/>
+              <w:right w:w="90" w:type="dxa"/>
+            </w:tcMar>
+          </w:tcPr>
+          <w:p>
+            <w:pPr>
+              <w:spacing w:before="0" w:after="40" w:line="240" w:lineRule="auto"/>
+            </w:pPr>
+            <w:r>
+              <w:rPr>
+                <w:sz w:val="17"/>
+              </w:rPr>
+              <w:t>Fixed notice; full run and Network Configuration identities; assessment/candidate identities; bound revisions/evidence; permissives; calculation inputs/results; outcome/status.</w:t>
+            </w:r>
+          </w:p>
+        </w:tc>
+      </w:tr>
+      <w:tr>
+        <w:tc>
+          <w:tcPr>
+            <w:tcW w:type="dxa" w:w="2100"/>
+            <w:vAlign w:val="center"/>
+            <w:tcMar>
+              <w:top w:w="90" w:type="dxa"/>
+              <w:left w:w="90" w:type="dxa"/>
+              <w:bottom w:w="90" w:type="dxa"/>
+              <w:right w:w="90" w:type="dxa"/>
+            </w:tcMar>
+          </w:tcPr>
+          <w:p>
+            <w:pPr>
+              <w:spacing w:before="0" w:after="40" w:line="240" w:lineRule="auto"/>
+            </w:pPr>
+            <w:r>
+              <w:rPr>
+                <w:sz w:val="17"/>
+              </w:rPr>
+              <w:t>Formal Validation</w:t>
+            </w:r>
+          </w:p>
+        </w:tc>
+        <w:tc>
+          <w:tcPr>
+            <w:tcW w:type="dxa" w:w="7260"/>
+            <w:vAlign w:val="center"/>
+            <w:tcMar>
+              <w:top w:w="90" w:type="dxa"/>
+              <w:left w:w="90" w:type="dxa"/>
+              <w:bottom w:w="90" w:type="dxa"/>
+              <w:right w:w="90" w:type="dxa"/>
+            </w:tcMar>
+          </w:tcPr>
+          <w:p>
+            <w:pPr>
+              <w:spacing w:before="0" w:after="40" w:line="240" w:lineRule="auto"/>
+            </w:pPr>
+            <w:r>
+              <w:rPr>
+                <w:sz w:val="17"/>
+              </w:rPr>
+              <w:t>Fixed notice; Validation Catalogue/test/method/criterion identities; execution/run/Network Configuration/build identities; FORMAL evidence class; checkpoints/findings/result.</w:t>
+            </w:r>
+          </w:p>
+        </w:tc>
+      </w:tr>
+      <w:tr>
+        <w:tc>
+          <w:tcPr>
+            <w:tcW w:type="dxa" w:w="2100"/>
+            <w:vAlign w:val="center"/>
+            <w:tcMar>
+              <w:top w:w="90" w:type="dxa"/>
+              <w:left w:w="90" w:type="dxa"/>
+              <w:bottom w:w="90" w:type="dxa"/>
+              <w:right w:w="90" w:type="dxa"/>
+            </w:tcMar>
+          </w:tcPr>
+          <w:p>
+            <w:pPr>
+              <w:spacing w:before="0" w:after="40" w:line="240" w:lineRule="auto"/>
+            </w:pPr>
+            <w:r>
+              <w:rPr>
+                <w:sz w:val="17"/>
+              </w:rPr>
+              <w:t>Evidence Library</w:t>
+            </w:r>
+          </w:p>
+        </w:tc>
+        <w:tc>
+          <w:tcPr>
+            <w:tcW w:type="dxa" w:w="7260"/>
+            <w:vAlign w:val="center"/>
+            <w:tcMar>
+              <w:top w:w="90" w:type="dxa"/>
+              <w:left w:w="90" w:type="dxa"/>
+              <w:bottom w:w="90" w:type="dxa"/>
+              <w:right w:w="90" w:type="dxa"/>
+            </w:tcMar>
+          </w:tcPr>
+          <w:p>
+            <w:pPr>
+              <w:spacing w:before="0" w:after="40" w:line="240" w:lineRule="auto"/>
+            </w:pPr>
+            <w:r>
+              <w:rPr>
+                <w:sz w:val="17"/>
+              </w:rPr>
+              <w:t>Fixed notice; evidence/package identities and class; source catalogue/configuration/execution/build identities; separate generation-build identity; immutable hashes/links.</w:t>
+            </w:r>
+          </w:p>
+        </w:tc>
+      </w:tr>
+      <w:tr>
+        <w:tc>
+          <w:tcPr>
+            <w:tcW w:type="dxa" w:w="2100"/>
+            <w:vAlign w:val="center"/>
+            <w:tcMar>
+              <w:top w:w="90" w:type="dxa"/>
+              <w:left w:w="90" w:type="dxa"/>
+              <w:bottom w:w="90" w:type="dxa"/>
+              <w:right w:w="90" w:type="dxa"/>
+            </w:tcMar>
+          </w:tcPr>
+          <w:p>
+            <w:pPr>
+              <w:spacing w:before="0" w:after="40" w:line="240" w:lineRule="auto"/>
+            </w:pPr>
+            <w:r>
+              <w:rPr>
+                <w:sz w:val="17"/>
+              </w:rPr>
+              <w:t>Defect Investigation</w:t>
+            </w:r>
+          </w:p>
+        </w:tc>
+        <w:tc>
+          <w:tcPr>
+            <w:tcW w:type="dxa" w:w="7260"/>
+            <w:vAlign w:val="center"/>
+            <w:tcMar>
+              <w:top w:w="90" w:type="dxa"/>
+              <w:left w:w="90" w:type="dxa"/>
+              <w:bottom w:w="90" w:type="dxa"/>
+              <w:right w:w="90" w:type="dxa"/>
+            </w:tcMar>
+          </w:tcPr>
+          <w:p>
+            <w:pPr>
+              <w:spacing w:before="0" w:after="40" w:line="240" w:lineRule="auto"/>
+            </w:pPr>
+            <w:r>
+              <w:rPr>
+                <w:sz w:val="17"/>
+              </w:rPr>
+              <w:t>Fixed notice; Network Configuration v1.0 failure, DEF-001, COR-001, corrected v1.1 repeat/regression identities; same-build and source-catalogue provenance.</w:t>
+            </w:r>
+          </w:p>
+        </w:tc>
+      </w:tr>
+      <w:tr>
+        <w:tc>
+          <w:tcPr>
+            <w:tcW w:type="dxa" w:w="2100"/>
+            <w:vAlign w:val="center"/>
+            <w:tcMar>
+              <w:top w:w="90" w:type="dxa"/>
+              <w:left w:w="90" w:type="dxa"/>
+              <w:bottom w:w="90" w:type="dxa"/>
+              <w:right w:w="90" w:type="dxa"/>
+            </w:tcMar>
+          </w:tcPr>
+          <w:p>
+            <w:pPr>
+              <w:spacing w:before="0" w:after="40" w:line="240" w:lineRule="auto"/>
+            </w:pPr>
+            <w:r>
+              <w:rPr>
+                <w:sz w:val="17"/>
+              </w:rPr>
+              <w:t>Engineering Basis</w:t>
+            </w:r>
+          </w:p>
+        </w:tc>
+        <w:tc>
+          <w:tcPr>
+            <w:tcW w:type="dxa" w:w="7260"/>
+            <w:vAlign w:val="center"/>
+            <w:tcMar>
+              <w:top w:w="90" w:type="dxa"/>
+              <w:left w:w="90" w:type="dxa"/>
+              <w:bottom w:w="90" w:type="dxa"/>
+              <w:right w:w="90" w:type="dxa"/>
+            </w:tcMar>
+          </w:tcPr>
+          <w:p>
+            <w:pPr>
+              <w:spacing w:before="0" w:after="40" w:line="240" w:lineRule="auto"/>
+            </w:pPr>
+            <w:r>
+              <w:rPr>
+                <w:sz w:val="17"/>
+              </w:rPr>
+              <w:t>Fixed notice; authoritative artefact/version/hash; requirement/source/module/view traceability; build metadata; read-only/no operational action.</w:t>
+            </w:r>
+          </w:p>
+        </w:tc>
+      </w:tr>
+    </w:tbl>
+    <w:p>
+      <w:r>
+        <w:t>STRUCTURAL_RECORD_SET is the following exact concrete review-member set. It is not an open-ended schema-adapter result: membership and one controlling owner are frozen below. A later accepted design change is required to add, remove, rename or reassign a member for this validation method.</w:t>
+      </w:r>
+    </w:p>
+    <w:tbl>
+      <w:tblPr>
+        <w:tblW w:type="dxa" w:w="9360"/>
+        <w:jc w:val="center"/>
+        <w:tblLayout w:type="fixed"/>
+        <w:tblLook w:firstColumn="1" w:firstRow="1" w:lastColumn="0" w:lastRow="0" w:noHBand="0" w:noVBand="1" w:val="04A0"/>
+        <w:tblInd w:type="dxa" w:w="120"/>
+        <w:tblBorders>
+          <w:top w:val="single" w:sz="6" w:color="B7B7B7"/>
+          <w:left w:val="single" w:sz="6" w:color="B7B7B7"/>
+          <w:bottom w:val="single" w:sz="6" w:color="B7B7B7"/>
+          <w:right w:val="single" w:sz="6" w:color="B7B7B7"/>
+          <w:insideH w:val="single" w:sz="6" w:color="B7B7B7"/>
+          <w:insideV w:val="single" w:sz="6" w:color="B7B7B7"/>
+        </w:tblBorders>
+      </w:tblPr>
+      <w:tblGrid>
+        <w:gridCol w:w="2100"/>
+        <w:gridCol w:w="7260"/>
+      </w:tblGrid>
+      <w:tr>
+        <w:trPr>
+          <w:tblHeader w:val="true"/>
+        </w:trPr>
+        <w:tc>
+          <w:tcPr>
+            <w:tcW w:type="dxa" w:w="2100"/>
+            <w:shd w:fill="D9EAF7"/>
+            <w:vAlign w:val="center"/>
+            <w:tcMar>
+              <w:top w:w="90" w:type="dxa"/>
+              <w:left w:w="90" w:type="dxa"/>
+              <w:bottom w:w="90" w:type="dxa"/>
+              <w:right w:w="90" w:type="dxa"/>
+            </w:tcMar>
+          </w:tcPr>
+          <w:p>
+            <w:pPr>
+              <w:spacing w:before="0" w:after="40" w:line="240" w:lineRule="auto"/>
+            </w:pPr>
+            <w:r>
+              <w:rPr>
+                <w:b/>
+                <w:sz w:val="17"/>
+              </w:rPr>
+              <w:t>Controlled field</w:t>
+            </w:r>
+          </w:p>
+        </w:tc>
+        <w:tc>
+          <w:tcPr>
+            <w:tcW w:type="dxa" w:w="7260"/>
+            <w:shd w:fill="D9EAF7"/>
+            <w:vAlign w:val="center"/>
+            <w:tcMar>
+              <w:top w:w="90" w:type="dxa"/>
+              <w:left w:w="90" w:type="dxa"/>
+              <w:bottom w:w="90" w:type="dxa"/>
+              <w:right w:w="90" w:type="dxa"/>
+            </w:tcMar>
+          </w:tcPr>
+          <w:p>
+            <w:pPr>
+              <w:spacing w:before="0" w:after="40" w:line="240" w:lineRule="auto"/>
+            </w:pPr>
+            <w:r>
+              <w:rPr>
+                <w:b/>
+                <w:sz w:val="17"/>
+              </w:rPr>
+              <w:t>Authoritative value / rule</w:t>
+            </w:r>
+          </w:p>
+        </w:tc>
+      </w:tr>
+      <w:tr>
+        <w:tc>
+          <w:tcPr>
+            <w:tcW w:type="dxa" w:w="2100"/>
+            <w:vAlign w:val="center"/>
+            <w:tcMar>
+              <w:top w:w="90" w:type="dxa"/>
+              <w:left w:w="90" w:type="dxa"/>
+              <w:bottom w:w="90" w:type="dxa"/>
+              <w:right w:w="90" w:type="dxa"/>
+            </w:tcMar>
+          </w:tcPr>
+          <w:p>
+            <w:pPr>
+              <w:spacing w:before="0" w:after="40" w:line="240" w:lineRule="auto"/>
+            </w:pPr>
+            <w:r>
+              <w:rPr>
+                <w:sz w:val="17"/>
+              </w:rPr>
+              <w:t>configuration</w:t>
+            </w:r>
+          </w:p>
+        </w:tc>
+        <w:tc>
+          <w:tcPr>
+            <w:tcW w:type="dxa" w:w="7260"/>
+            <w:vAlign w:val="center"/>
+            <w:tcMar>
+              <w:top w:w="90" w:type="dxa"/>
+              <w:left w:w="90" w:type="dxa"/>
+              <w:bottom w:w="90" w:type="dxa"/>
+              <w:right w:w="90" w:type="dxa"/>
+            </w:tcMar>
+          </w:tcPr>
+          <w:p>
+            <w:pPr>
+              <w:spacing w:before="0" w:after="40" w:line="240" w:lineRule="auto"/>
+            </w:pPr>
+            <w:r>
+              <w:rPr>
+                <w:sz w:val="17"/>
+              </w:rPr>
+              <w:t>ConfigurationCatalogEntry; NetworkEntity; ConnectivityEdge; LoadCapacity; CustomerZoneMapping; ConfigurationManifest</w:t>
+            </w:r>
+          </w:p>
+        </w:tc>
+      </w:tr>
+      <w:tr>
+        <w:tc>
+          <w:tcPr>
+            <w:tcW w:type="dxa" w:w="2100"/>
+            <w:vAlign w:val="center"/>
+            <w:tcMar>
+              <w:top w:w="90" w:type="dxa"/>
+              <w:left w:w="90" w:type="dxa"/>
+              <w:bottom w:w="90" w:type="dxa"/>
+              <w:right w:w="90" w:type="dxa"/>
+            </w:tcMar>
+          </w:tcPr>
+          <w:p>
+            <w:pPr>
+              <w:spacing w:before="0" w:after="40" w:line="240" w:lineRule="auto"/>
+            </w:pPr>
+            <w:r>
+              <w:rPr>
+                <w:sz w:val="17"/>
+              </w:rPr>
+              <w:t>scenario</w:t>
+            </w:r>
+          </w:p>
+        </w:tc>
+        <w:tc>
+          <w:tcPr>
+            <w:tcW w:type="dxa" w:w="7260"/>
+            <w:vAlign w:val="center"/>
+            <w:tcMar>
+              <w:top w:w="90" w:type="dxa"/>
+              <w:left w:w="90" w:type="dxa"/>
+              <w:bottom w:w="90" w:type="dxa"/>
+              <w:right w:w="90" w:type="dxa"/>
+            </w:tcMar>
+          </w:tcPr>
+          <w:p>
+            <w:pPr>
+              <w:spacing w:before="0" w:after="40" w:line="240" w:lineRule="auto"/>
+            </w:pPr>
+            <w:r>
+              <w:rPr>
+                <w:sz w:val="17"/>
+              </w:rPr>
+              <w:t>ScenarioRun</w:t>
+            </w:r>
+          </w:p>
+        </w:tc>
+      </w:tr>
+      <w:tr>
+        <w:tc>
+          <w:tcPr>
+            <w:tcW w:type="dxa" w:w="2100"/>
+            <w:vAlign w:val="center"/>
+            <w:tcMar>
+              <w:top w:w="90" w:type="dxa"/>
+              <w:left w:w="90" w:type="dxa"/>
+              <w:bottom w:w="90" w:type="dxa"/>
+              <w:right w:w="90" w:type="dxa"/>
+            </w:tcMar>
+          </w:tcPr>
+          <w:p>
+            <w:pPr>
+              <w:spacing w:before="0" w:after="40" w:line="240" w:lineRule="auto"/>
+            </w:pPr>
+            <w:r>
+              <w:rPr>
+                <w:sz w:val="17"/>
+              </w:rPr>
+              <w:t>telemetry</w:t>
+            </w:r>
+          </w:p>
+        </w:tc>
+        <w:tc>
+          <w:tcPr>
+            <w:tcW w:type="dxa" w:w="7260"/>
+            <w:vAlign w:val="center"/>
+            <w:tcMar>
+              <w:top w:w="90" w:type="dxa"/>
+              <w:left w:w="90" w:type="dxa"/>
+              <w:bottom w:w="90" w:type="dxa"/>
+              <w:right w:w="90" w:type="dxa"/>
+            </w:tcMar>
+          </w:tcPr>
+          <w:p>
+            <w:pPr>
+              <w:spacing w:before="0" w:after="40" w:line="240" w:lineRule="auto"/>
+            </w:pPr>
+            <w:r>
+              <w:rPr>
+                <w:sz w:val="17"/>
+              </w:rPr>
+              <w:t>TelemetryPoint; TelemetryValidity; Alarm; TelemetrySnapshot</w:t>
+            </w:r>
+          </w:p>
+        </w:tc>
+      </w:tr>
+      <w:tr>
+        <w:tc>
+          <w:tcPr>
+            <w:tcW w:type="dxa" w:w="2100"/>
+            <w:vAlign w:val="center"/>
+            <w:tcMar>
+              <w:top w:w="90" w:type="dxa"/>
+              <w:left w:w="90" w:type="dxa"/>
+              <w:bottom w:w="90" w:type="dxa"/>
+              <w:right w:w="90" w:type="dxa"/>
+            </w:tcMar>
+          </w:tcPr>
+          <w:p>
+            <w:pPr>
+              <w:spacing w:before="0" w:after="40" w:line="240" w:lineRule="auto"/>
+            </w:pPr>
+            <w:r>
+              <w:rPr>
+                <w:sz w:val="17"/>
+              </w:rPr>
+              <w:t>topology/outage</w:t>
+            </w:r>
+          </w:p>
+        </w:tc>
+        <w:tc>
+          <w:tcPr>
+            <w:tcW w:type="dxa" w:w="7260"/>
+            <w:vAlign w:val="center"/>
+            <w:tcMar>
+              <w:top w:w="90" w:type="dxa"/>
+              <w:left w:w="90" w:type="dxa"/>
+              <w:bottom w:w="90" w:type="dxa"/>
+              <w:right w:w="90" w:type="dxa"/>
+            </w:tcMar>
+          </w:tcPr>
+          <w:p>
+            <w:pPr>
+              <w:spacing w:before="0" w:after="40" w:line="240" w:lineRule="auto"/>
+            </w:pPr>
+            <w:r>
+              <w:rPr>
+                <w:sz w:val="17"/>
+              </w:rPr>
+              <w:t>TopologySnapshot; SectionDerivedState; IsolationProof; OutageSnapshot; CalculationTrace</w:t>
+            </w:r>
+          </w:p>
+        </w:tc>
+      </w:tr>
+      <w:tr>
+        <w:tc>
+          <w:tcPr>
+            <w:tcW w:type="dxa" w:w="2100"/>
+            <w:vAlign w:val="center"/>
+            <w:tcMar>
+              <w:top w:w="90" w:type="dxa"/>
+              <w:left w:w="90" w:type="dxa"/>
+              <w:bottom w:w="90" w:type="dxa"/>
+              <w:right w:w="90" w:type="dxa"/>
+            </w:tcMar>
+          </w:tcPr>
+          <w:p>
+            <w:pPr>
+              <w:spacing w:before="0" w:after="40" w:line="240" w:lineRule="auto"/>
+            </w:pPr>
+            <w:r>
+              <w:rPr>
+                <w:sz w:val="17"/>
+              </w:rPr>
+              <w:t>restoration</w:t>
+            </w:r>
+          </w:p>
+        </w:tc>
+        <w:tc>
+          <w:tcPr>
+            <w:tcW w:type="dxa" w:w="7260"/>
+            <w:vAlign w:val="center"/>
+            <w:tcMar>
+              <w:top w:w="90" w:type="dxa"/>
+              <w:left w:w="90" w:type="dxa"/>
+              <w:bottom w:w="90" w:type="dxa"/>
+              <w:right w:w="90" w:type="dxa"/>
+            </w:tcMar>
+          </w:tcPr>
+          <w:p>
+            <w:pPr>
+              <w:spacing w:before="0" w:after="40" w:line="240" w:lineRule="auto"/>
+            </w:pPr>
+            <w:r>
+              <w:rPr>
+                <w:sz w:val="17"/>
+              </w:rPr>
+              <w:t>RestorationCandidate; PermissiveResult; RestorationAssessment; AssessmentInvalidation; RestorationExecutionBinding</w:t>
+            </w:r>
+          </w:p>
+        </w:tc>
+      </w:tr>
+      <w:tr>
+        <w:tc>
+          <w:tcPr>
+            <w:tcW w:type="dxa" w:w="2100"/>
+            <w:vAlign w:val="center"/>
+            <w:tcMar>
+              <w:top w:w="90" w:type="dxa"/>
+              <w:left w:w="90" w:type="dxa"/>
+              <w:bottom w:w="90" w:type="dxa"/>
+              <w:right w:w="90" w:type="dxa"/>
+            </w:tcMar>
+          </w:tcPr>
+          <w:p>
+            <w:pPr>
+              <w:spacing w:before="0" w:after="40" w:line="240" w:lineRule="auto"/>
+            </w:pPr>
+            <w:r>
+              <w:rPr>
+                <w:sz w:val="17"/>
+              </w:rPr>
+              <w:t>events</w:t>
+            </w:r>
+          </w:p>
+        </w:tc>
+        <w:tc>
+          <w:tcPr>
+            <w:tcW w:type="dxa" w:w="7260"/>
+            <w:vAlign w:val="center"/>
+            <w:tcMar>
+              <w:top w:w="90" w:type="dxa"/>
+              <w:left w:w="90" w:type="dxa"/>
+              <w:bottom w:w="90" w:type="dxa"/>
+              <w:right w:w="90" w:type="dxa"/>
+            </w:tcMar>
+          </w:tcPr>
+          <w:p>
+            <w:pPr>
+              <w:spacing w:before="0" w:after="40" w:line="240" w:lineRule="auto"/>
+            </w:pPr>
+            <w:r>
+              <w:rPr>
+                <w:sz w:val="17"/>
+              </w:rPr>
+              <w:t>OperationalEvent</w:t>
+            </w:r>
+          </w:p>
+        </w:tc>
+      </w:tr>
+      <w:tr>
+        <w:tc>
+          <w:tcPr>
+            <w:tcW w:type="dxa" w:w="2100"/>
+            <w:vAlign w:val="center"/>
+            <w:tcMar>
+              <w:top w:w="90" w:type="dxa"/>
+              <w:left w:w="90" w:type="dxa"/>
+              <w:bottom w:w="90" w:type="dxa"/>
+              <w:right w:w="90" w:type="dxa"/>
+            </w:tcMar>
+          </w:tcPr>
+          <w:p>
+            <w:pPr>
+              <w:spacing w:before="0" w:after="40" w:line="240" w:lineRule="auto"/>
+            </w:pPr>
+            <w:r>
+              <w:rPr>
+                <w:sz w:val="17"/>
+              </w:rPr>
+              <w:t>validation</w:t>
+            </w:r>
+          </w:p>
+        </w:tc>
+        <w:tc>
+          <w:tcPr>
+            <w:tcW w:type="dxa" w:w="7260"/>
+            <w:vAlign w:val="center"/>
+            <w:tcMar>
+              <w:top w:w="90" w:type="dxa"/>
+              <w:left w:w="90" w:type="dxa"/>
+              <w:bottom w:w="90" w:type="dxa"/>
+              <w:right w:w="90" w:type="dxa"/>
+            </w:tcMar>
+          </w:tcPr>
+          <w:p>
+            <w:pPr>
+              <w:spacing w:before="0" w:after="40" w:line="240" w:lineRule="auto"/>
+            </w:pPr>
+            <w:r>
+              <w:rPr>
+                <w:sz w:val="17"/>
+              </w:rPr>
+              <w:t>TestDefinition; ValidationExecution; EvidenceSnapshot; ExecutedValidationResult; DefectRecord; CorrectionRecord; RepeatLink</w:t>
+            </w:r>
+          </w:p>
+        </w:tc>
+      </w:tr>
+      <w:tr>
+        <w:tc>
+          <w:tcPr>
+            <w:tcW w:type="dxa" w:w="2100"/>
+            <w:vAlign w:val="center"/>
+            <w:tcMar>
+              <w:top w:w="90" w:type="dxa"/>
+              <w:left w:w="90" w:type="dxa"/>
+              <w:bottom w:w="90" w:type="dxa"/>
+              <w:right w:w="90" w:type="dxa"/>
+            </w:tcMar>
+          </w:tcPr>
+          <w:p>
+            <w:pPr>
+              <w:spacing w:before="0" w:after="40" w:line="240" w:lineRule="auto"/>
+            </w:pPr>
+            <w:r>
+              <w:rPr>
+                <w:sz w:val="17"/>
+              </w:rPr>
+              <w:t>validation_assurance</w:t>
+            </w:r>
+          </w:p>
+        </w:tc>
+        <w:tc>
+          <w:tcPr>
+            <w:tcW w:type="dxa" w:w="7260"/>
+            <w:vAlign w:val="center"/>
+            <w:tcMar>
+              <w:top w:w="90" w:type="dxa"/>
+              <w:left w:w="90" w:type="dxa"/>
+              <w:bottom w:w="90" w:type="dxa"/>
+              <w:right w:w="90" w:type="dxa"/>
+            </w:tcMar>
+          </w:tcPr>
+          <w:p>
+            <w:pPr>
+              <w:spacing w:before="0" w:after="40" w:line="240" w:lineRule="auto"/>
+            </w:pPr>
+            <w:r>
+              <w:rPr>
+                <w:sz w:val="17"/>
+              </w:rPr>
+              <w:t>ConstituentCaseDefinition; CompositeValidationResult; CompositeConstituentLink; AcceptedCatalogueRevision; ValidationSuspensionCondition; ValidationSuspensionRecord; SuspensionEvidenceRecord; ValidationAttempt; ValidationTargetSelection; DeterminationMethodDefinition; CriterionDefinition; DeterminationContext; CriterionFinding; EngineeringReviewProposal; EngineeringReviewFinalisation</w:t>
+            </w:r>
+          </w:p>
+        </w:tc>
+      </w:tr>
+      <w:tr>
+        <w:tc>
+          <w:tcPr>
+            <w:tcW w:type="dxa" w:w="2100"/>
+            <w:vAlign w:val="center"/>
+            <w:tcMar>
+              <w:top w:w="90" w:type="dxa"/>
+              <w:left w:w="90" w:type="dxa"/>
+              <w:bottom w:w="90" w:type="dxa"/>
+              <w:right w:w="90" w:type="dxa"/>
+            </w:tcMar>
+          </w:tcPr>
+          <w:p>
+            <w:pPr>
+              <w:spacing w:before="0" w:after="40" w:line="240" w:lineRule="auto"/>
+            </w:pPr>
+            <w:r>
+              <w:rPr>
+                <w:sz w:val="17"/>
+              </w:rPr>
+              <w:t>evidence_export</w:t>
+            </w:r>
+          </w:p>
+        </w:tc>
+        <w:tc>
+          <w:tcPr>
+            <w:tcW w:type="dxa" w:w="7260"/>
+            <w:vAlign w:val="center"/>
+            <w:tcMar>
+              <w:top w:w="90" w:type="dxa"/>
+              <w:left w:w="90" w:type="dxa"/>
+              <w:bottom w:w="90" w:type="dxa"/>
+              <w:right w:w="90" w:type="dxa"/>
+            </w:tcMar>
+          </w:tcPr>
+          <w:p>
+            <w:pPr>
+              <w:spacing w:before="0" w:after="40" w:line="240" w:lineRule="auto"/>
+            </w:pPr>
+            <w:r>
+              <w:rPr>
+                <w:sz w:val="17"/>
+              </w:rPr>
+              <w:t>EvidencePackage</w:t>
+            </w:r>
+          </w:p>
+        </w:tc>
+      </w:tr>
+    </w:tbl>
+    <w:p>
+      <w:r>
+        <w:t>VT-TOP-DEF-001 presentation shows the Network Configuration v1.0 FAIL and corrected Network Configuration v1.1 PASS as separate one-run executions. DEF-001/COR-001/repeat links may navigate between them, but the UI must not label their relationship as one aggregate execution or a meta-PASS. Fixture review shows fixture definition/version/hash, inputs/results, executing build and configuration/hash provenance and never invents a run identity.</w:t>
       </w:r>
     </w:p>
     <w:p>

</xml_diff>

<commit_message>
Accept DC-006 authoritative document baseline
</commit_message>
<xml_diff>
--- a/01-engineering-source-documents/OT Project Demonstrator Design.docx
+++ b/01-engineering-source-documents/OT Project Demonstrator Design.docx
@@ -25,9 +25,9 @@
         <w:br/>
         <w:t>Document: OT Project Demonstrator Design</w:t>
         <w:br/>
-        <w:t>Version: 0.5 (proposed)</w:t>
+        <w:t>Version: 0.5</w:t>
         <w:br/>
-        <w:t>Status: Draft — DC-006 authoritative-document application pending independent review; accepted baseline remains Demonstrator Design v0.4</w:t>
+        <w:t>Status: Draft — accepted authoritative demonstrator-design baseline through DC-006; supersedes v0.4; machine/catalogue application pending separate authorisation; I9 stopped</w:t>
       </w:r>
     </w:p>
     <w:p>
@@ -24469,12 +24469,12 @@
         <w:pStyle w:val="Heading1"/>
       </w:pPr>
       <w:r>
-        <w:t>38. Proposed Controlled Amendment — DC-006 Determination Demonstrator Design</w:t>
-      </w:r>
-    </w:p>
-    <w:p>
-      <w:r>
-        <w:t>This proposed Section 38 defines the application structures required to implement the accepted DC-006 design in a future separately authorised phase. It changes validation-assurance design only. Demonstrator Design v0.4 remains accepted until this proposed v0.5 application is independently reviewed and accepted.</w:t>
+        <w:t>38. Accepted Controlled Amendment — DC-006 Determination Demonstrator Design</w:t>
+      </w:r>
+    </w:p>
+    <w:p>
+      <w:r>
+        <w:t>This accepted Section 38 defines the application structures required to implement the accepted DC-006 design in a future separately authorised phase. It changes validation-assurance design only. Demonstrator Design v0.5 is the accepted current demonstrator-design baseline and supersedes v0.4. Machine/catalogue application requires separate authorisation and I9 remains stopped.</w:t>
       </w:r>
     </w:p>
     <w:p>
@@ -27177,7 +27177,7 @@
         <w:pStyle w:val="Heading2"/>
       </w:pPr>
       <w:r>
-        <w:t>38.8 Proposed Application and Review Gate</w:t>
+        <w:t>38.8 Accepted Application and Review Gate</w:t>
       </w:r>
     </w:p>
     <w:p>
@@ -27187,7 +27187,7 @@
     </w:p>
     <w:p>
       <w:r>
-        <w:t>DC-006 design decision is independently accepted. This Section 38 and proposed Demonstrator Design v0.5 are an authoritative-document application pending independent review. No machine Validation Catalogue, schema, migration, application, dependency or I9 authority is granted.</w:t>
+        <w:t>DC-006 design and authoritative-document application are independently accepted. This Section 38 and Demonstrator Design v0.5 are the accepted current demonstrator-design baseline, superseding v0.4. Machine Validation Catalogue, schema, migration, application and dependency work remain pending separate authorisation; I9 remains stopped.</w:t>
       </w:r>
     </w:p>
     <w:p>

</xml_diff>